<commit_message>
bug-fix for orm module should be done also: - add user model - add auth - multithreading
</commit_message>
<xml_diff>
--- a/DB/Lab4/Лаба4.docx
+++ b/DB/Lab4/Лаба4.docx
@@ -198,7 +198,6 @@
           <w:bCs/>
           <w:sz w:val="28"/>
           <w:szCs w:val="28"/>
-          <w:lang w:val="en-US"/>
         </w:rPr>
       </w:pPr>
       <w:r>
@@ -218,7 +217,6 @@
           <w:bCs/>
           <w:sz w:val="28"/>
           <w:szCs w:val="28"/>
-          <w:lang w:val="en-US"/>
         </w:rPr>
         <w:t>3652</w:t>
       </w:r>
@@ -314,7 +312,7 @@
           <w:sz w:val="26"/>
           <w:szCs w:val="26"/>
         </w:rPr>
-        <w:t xml:space="preserve"> </w:t>
+        <w:t xml:space="preserve"> студент группы </w:t>
       </w:r>
       <w:r>
         <w:rPr>
@@ -323,8 +321,9 @@
           <w:bCs/>
           <w:sz w:val="26"/>
           <w:szCs w:val="26"/>
-        </w:rPr>
-        <w:t>студент группы</w:t>
+          <w:lang w:val="en-US"/>
+        </w:rPr>
+        <w:t>P</w:t>
       </w:r>
       <w:r>
         <w:rPr>
@@ -334,7 +333,7 @@
           <w:sz w:val="26"/>
           <w:szCs w:val="26"/>
         </w:rPr>
-        <w:t xml:space="preserve"> </w:t>
+        <w:t>3110</w:t>
       </w:r>
       <w:r>
         <w:rPr>
@@ -343,11 +342,31 @@
           <w:bCs/>
           <w:sz w:val="26"/>
           <w:szCs w:val="26"/>
-          <w:lang w:val="en-US"/>
-        </w:rPr>
-        <w:t>P</w:t>
-      </w:r>
-      <w:r>
+        </w:rPr>
+        <w:t>:</w:t>
+      </w:r>
+    </w:p>
+    <w:p>
+      <w:pPr>
+        <w:ind w:left="3544" w:right="-144"/>
+        <w:rPr>
+          <w:rFonts w:ascii="Times New Roman" w:hAnsi="Times New Roman" w:cs="Times New Roman"/>
+          <w:sz w:val="26"/>
+          <w:szCs w:val="26"/>
+        </w:rPr>
+      </w:pPr>
+      <w:r>
+        <w:rPr>
+          <w:rFonts w:ascii="Times New Roman" w:hAnsi="Times New Roman" w:cs="Times New Roman"/>
+          <w:sz w:val="26"/>
+          <w:szCs w:val="26"/>
+        </w:rPr>
+        <w:t>Прохоревич Иван Борисович</w:t>
+      </w:r>
+    </w:p>
+    <w:p>
+      <w:pPr>
+        <w:ind w:left="3544" w:right="-144"/>
         <w:rPr>
           <w:rFonts w:ascii="Times New Roman" w:hAnsi="Times New Roman" w:cs="Times New Roman"/>
           <w:b/>
@@ -355,8 +374,7 @@
           <w:sz w:val="26"/>
           <w:szCs w:val="26"/>
         </w:rPr>
-        <w:t>3110</w:t>
-      </w:r>
+      </w:pPr>
       <w:r>
         <w:rPr>
           <w:rFonts w:ascii="Times New Roman" w:hAnsi="Times New Roman" w:cs="Times New Roman"/>
@@ -365,25 +383,7 @@
           <w:sz w:val="26"/>
           <w:szCs w:val="26"/>
         </w:rPr>
-        <w:t>:</w:t>
-      </w:r>
-    </w:p>
-    <w:p>
-      <w:pPr>
-        <w:ind w:left="3544" w:right="-144"/>
-        <w:rPr>
-          <w:rFonts w:ascii="Times New Roman" w:hAnsi="Times New Roman" w:cs="Times New Roman"/>
-          <w:sz w:val="26"/>
-          <w:szCs w:val="26"/>
-        </w:rPr>
-      </w:pPr>
-      <w:r>
-        <w:rPr>
-          <w:rFonts w:ascii="Times New Roman" w:hAnsi="Times New Roman" w:cs="Times New Roman"/>
-          <w:sz w:val="26"/>
-          <w:szCs w:val="26"/>
-        </w:rPr>
-        <w:t>Прохоревич Иван Борисович</w:t>
+        <w:t>Преподаватель:</w:t>
       </w:r>
     </w:p>
     <w:p>
@@ -400,38 +400,6 @@
       <w:r>
         <w:rPr>
           <w:rFonts w:ascii="Times New Roman" w:hAnsi="Times New Roman" w:cs="Times New Roman"/>
-          <w:b/>
-          <w:bCs/>
-          <w:sz w:val="26"/>
-          <w:szCs w:val="26"/>
-        </w:rPr>
-        <w:t>Преподаватель</w:t>
-      </w:r>
-      <w:r>
-        <w:rPr>
-          <w:rFonts w:ascii="Times New Roman" w:hAnsi="Times New Roman" w:cs="Times New Roman"/>
-          <w:b/>
-          <w:bCs/>
-          <w:sz w:val="26"/>
-          <w:szCs w:val="26"/>
-        </w:rPr>
-        <w:t>:</w:t>
-      </w:r>
-    </w:p>
-    <w:p>
-      <w:pPr>
-        <w:ind w:left="3544" w:right="-144"/>
-        <w:rPr>
-          <w:rFonts w:ascii="Times New Roman" w:hAnsi="Times New Roman" w:cs="Times New Roman"/>
-          <w:b/>
-          <w:bCs/>
-          <w:sz w:val="26"/>
-          <w:szCs w:val="26"/>
-        </w:rPr>
-      </w:pPr>
-      <w:r>
-        <w:rPr>
-          <w:rFonts w:ascii="Times New Roman" w:hAnsi="Times New Roman" w:cs="Times New Roman"/>
           <w:sz w:val="26"/>
           <w:szCs w:val="26"/>
         </w:rPr>
@@ -521,7 +489,7 @@
     <w:sdt>
       <w:sdtPr>
         <w:rPr>
-          <w:rFonts w:asciiTheme="minorHAnsi" w:eastAsiaTheme="minorHAnsi" w:hAnsiTheme="minorHAnsi" w:cstheme="minorBidi"/>
+          <w:rFonts w:ascii="Times New Roman" w:eastAsiaTheme="minorHAnsi" w:hAnsi="Times New Roman" w:cs="Times New Roman"/>
           <w:color w:val="auto"/>
           <w:kern w:val="2"/>
           <w:sz w:val="28"/>
@@ -582,15 +550,24 @@
             </w:rPr>
           </w:pPr>
           <w:r>
+            <w:rPr>
+              <w:rFonts w:ascii="Times New Roman" w:hAnsi="Times New Roman" w:cs="Times New Roman"/>
+            </w:rPr>
             <w:fldChar w:fldCharType="begin"/>
           </w:r>
           <w:r>
+            <w:rPr>
+              <w:rFonts w:ascii="Times New Roman" w:hAnsi="Times New Roman" w:cs="Times New Roman"/>
+            </w:rPr>
             <w:instrText xml:space="preserve"> TOC \o "1-3" \h \z \u </w:instrText>
           </w:r>
           <w:r>
+            <w:rPr>
+              <w:rFonts w:ascii="Times New Roman" w:hAnsi="Times New Roman" w:cs="Times New Roman"/>
+            </w:rPr>
             <w:fldChar w:fldCharType="separate"/>
           </w:r>
-          <w:hyperlink w:anchor="_Toc230792075" w:history="1">
+          <w:hyperlink w:anchor="_Toc231281402" w:history="1">
             <w:r>
               <w:rPr>
                 <w:rStyle w:val="af0"/>
@@ -619,7 +596,7 @@
                 <w:noProof/>
                 <w:webHidden/>
               </w:rPr>
-              <w:instrText xml:space="preserve"> PAGEREF _Toc230792075 \h </w:instrText>
+              <w:instrText xml:space="preserve"> PAGEREF _Toc231281402 \h </w:instrText>
             </w:r>
             <w:r>
               <w:rPr>
@@ -651,8 +628,230 @@
           </w:hyperlink>
         </w:p>
         <w:p>
+          <w:pPr>
+            <w:pStyle w:val="11"/>
+            <w:tabs>
+              <w:tab w:val="right" w:leader="dot" w:pos="9344"/>
+            </w:tabs>
+            <w:rPr>
+              <w:rFonts w:eastAsiaTheme="minorEastAsia"/>
+              <w:noProof/>
+              <w:lang w:eastAsia="ru-RU"/>
+            </w:rPr>
+          </w:pPr>
+          <w:hyperlink w:anchor="_Toc231281403" w:history="1">
+            <w:r>
+              <w:rPr>
+                <w:rStyle w:val="af0"/>
+                <w:b/>
+                <w:bCs/>
+                <w:noProof/>
+              </w:rPr>
+              <w:t>Запрос №1</w:t>
+            </w:r>
+            <w:r>
+              <w:rPr>
+                <w:noProof/>
+                <w:webHidden/>
+              </w:rPr>
+              <w:tab/>
+            </w:r>
+            <w:r>
+              <w:rPr>
+                <w:noProof/>
+                <w:webHidden/>
+              </w:rPr>
+              <w:fldChar w:fldCharType="begin"/>
+            </w:r>
+            <w:r>
+              <w:rPr>
+                <w:noProof/>
+                <w:webHidden/>
+              </w:rPr>
+              <w:instrText xml:space="preserve"> PAGEREF _Toc231281403 \h </w:instrText>
+            </w:r>
+            <w:r>
+              <w:rPr>
+                <w:noProof/>
+                <w:webHidden/>
+              </w:rPr>
+            </w:r>
+            <w:r>
+              <w:rPr>
+                <w:noProof/>
+                <w:webHidden/>
+              </w:rPr>
+              <w:fldChar w:fldCharType="separate"/>
+            </w:r>
+            <w:r>
+              <w:rPr>
+                <w:noProof/>
+                <w:webHidden/>
+              </w:rPr>
+              <w:t>4</w:t>
+            </w:r>
+            <w:r>
+              <w:rPr>
+                <w:noProof/>
+                <w:webHidden/>
+              </w:rPr>
+              <w:fldChar w:fldCharType="end"/>
+            </w:r>
+          </w:hyperlink>
+        </w:p>
+        <w:p>
+          <w:pPr>
+            <w:pStyle w:val="11"/>
+            <w:tabs>
+              <w:tab w:val="right" w:leader="dot" w:pos="9344"/>
+            </w:tabs>
+            <w:rPr>
+              <w:rFonts w:eastAsiaTheme="minorEastAsia"/>
+              <w:noProof/>
+              <w:lang w:eastAsia="ru-RU"/>
+            </w:rPr>
+          </w:pPr>
+          <w:hyperlink w:anchor="_Toc231281404" w:history="1">
+            <w:r>
+              <w:rPr>
+                <w:rStyle w:val="af0"/>
+                <w:b/>
+                <w:bCs/>
+                <w:noProof/>
+              </w:rPr>
+              <w:t>Запрос №2</w:t>
+            </w:r>
+            <w:r>
+              <w:rPr>
+                <w:noProof/>
+                <w:webHidden/>
+              </w:rPr>
+              <w:tab/>
+            </w:r>
+            <w:r>
+              <w:rPr>
+                <w:noProof/>
+                <w:webHidden/>
+              </w:rPr>
+              <w:fldChar w:fldCharType="begin"/>
+            </w:r>
+            <w:r>
+              <w:rPr>
+                <w:noProof/>
+                <w:webHidden/>
+              </w:rPr>
+              <w:instrText xml:space="preserve"> PAGEREF _Toc231281404 \h </w:instrText>
+            </w:r>
+            <w:r>
+              <w:rPr>
+                <w:noProof/>
+                <w:webHidden/>
+              </w:rPr>
+            </w:r>
+            <w:r>
+              <w:rPr>
+                <w:noProof/>
+                <w:webHidden/>
+              </w:rPr>
+              <w:fldChar w:fldCharType="separate"/>
+            </w:r>
+            <w:r>
+              <w:rPr>
+                <w:noProof/>
+                <w:webHidden/>
+              </w:rPr>
+              <w:t>6</w:t>
+            </w:r>
+            <w:r>
+              <w:rPr>
+                <w:noProof/>
+                <w:webHidden/>
+              </w:rPr>
+              <w:fldChar w:fldCharType="end"/>
+            </w:r>
+          </w:hyperlink>
+        </w:p>
+        <w:p>
+          <w:pPr>
+            <w:pStyle w:val="11"/>
+            <w:tabs>
+              <w:tab w:val="right" w:leader="dot" w:pos="9344"/>
+            </w:tabs>
+            <w:rPr>
+              <w:rFonts w:eastAsiaTheme="minorEastAsia"/>
+              <w:noProof/>
+              <w:lang w:eastAsia="ru-RU"/>
+            </w:rPr>
+          </w:pPr>
+          <w:hyperlink w:anchor="_Toc231281405" w:history="1">
+            <w:r>
+              <w:rPr>
+                <w:rStyle w:val="af0"/>
+                <w:b/>
+                <w:bCs/>
+                <w:noProof/>
+              </w:rPr>
+              <w:t>Вывод</w:t>
+            </w:r>
+            <w:r>
+              <w:rPr>
+                <w:noProof/>
+                <w:webHidden/>
+              </w:rPr>
+              <w:tab/>
+            </w:r>
+            <w:r>
+              <w:rPr>
+                <w:noProof/>
+                <w:webHidden/>
+              </w:rPr>
+              <w:fldChar w:fldCharType="begin"/>
+            </w:r>
+            <w:r>
+              <w:rPr>
+                <w:noProof/>
+                <w:webHidden/>
+              </w:rPr>
+              <w:instrText xml:space="preserve"> PAGEREF _Toc231281405 \h </w:instrText>
+            </w:r>
+            <w:r>
+              <w:rPr>
+                <w:noProof/>
+                <w:webHidden/>
+              </w:rPr>
+            </w:r>
+            <w:r>
+              <w:rPr>
+                <w:noProof/>
+                <w:webHidden/>
+              </w:rPr>
+              <w:fldChar w:fldCharType="separate"/>
+            </w:r>
+            <w:r>
+              <w:rPr>
+                <w:noProof/>
+                <w:webHidden/>
+              </w:rPr>
+              <w:t>8</w:t>
+            </w:r>
+            <w:r>
+              <w:rPr>
+                <w:noProof/>
+                <w:webHidden/>
+              </w:rPr>
+              <w:fldChar w:fldCharType="end"/>
+            </w:r>
+          </w:hyperlink>
+        </w:p>
+        <w:p>
+          <w:pPr>
+            <w:rPr>
+              <w:rFonts w:ascii="Times New Roman" w:hAnsi="Times New Roman" w:cs="Times New Roman"/>
+            </w:rPr>
+          </w:pPr>
           <w:r>
             <w:rPr>
+              <w:rFonts w:ascii="Times New Roman" w:hAnsi="Times New Roman" w:cs="Times New Roman"/>
               <w:b/>
               <w:bCs/>
             </w:rPr>
@@ -686,7 +885,7 @@
           <w:szCs w:val="26"/>
         </w:rPr>
       </w:pPr>
-      <w:bookmarkStart w:id="0" w:name="_Toc230792075"/>
+      <w:bookmarkStart w:id="0" w:name="_Toc231281402"/>
       <w:r>
         <w:rPr>
           <w:rStyle w:val="af4"/>
@@ -723,7 +922,6 @@
           <w:rFonts w:ascii="Times New Roman" w:hAnsi="Times New Roman" w:cs="Times New Roman"/>
           <w:sz w:val="26"/>
           <w:szCs w:val="26"/>
-          <w:lang w:val="en-US"/>
         </w:rPr>
       </w:pPr>
       <w:r>
@@ -743,7 +941,6 @@
           <w:rFonts w:ascii="Times New Roman" w:hAnsi="Times New Roman" w:cs="Times New Roman"/>
           <w:sz w:val="26"/>
           <w:szCs w:val="26"/>
-          <w:lang w:val="en-US"/>
         </w:rPr>
       </w:pPr>
     </w:p>
@@ -755,7 +952,6 @@
           <w:rFonts w:ascii="Times New Roman" w:hAnsi="Times New Roman" w:cs="Times New Roman"/>
           <w:sz w:val="26"/>
           <w:szCs w:val="26"/>
-          <w:lang w:val="en-US"/>
         </w:rPr>
       </w:pPr>
       <w:r>
@@ -775,7 +971,6 @@
           <w:rFonts w:ascii="Times New Roman" w:hAnsi="Times New Roman" w:cs="Times New Roman"/>
           <w:sz w:val="26"/>
           <w:szCs w:val="26"/>
-          <w:lang w:val="en-US"/>
         </w:rPr>
       </w:pPr>
     </w:p>
@@ -806,7 +1001,6 @@
           <w:rFonts w:ascii="Times New Roman" w:hAnsi="Times New Roman" w:cs="Times New Roman"/>
           <w:sz w:val="26"/>
           <w:szCs w:val="26"/>
-          <w:lang w:val="en-US"/>
         </w:rPr>
       </w:pPr>
       <w:r>
@@ -826,7 +1020,6 @@
           <w:rFonts w:ascii="Times New Roman" w:hAnsi="Times New Roman" w:cs="Times New Roman"/>
           <w:sz w:val="26"/>
           <w:szCs w:val="26"/>
-          <w:lang w:val="en-US"/>
         </w:rPr>
       </w:pPr>
     </w:p>
@@ -950,7 +1143,25 @@
           <w:sz w:val="26"/>
           <w:szCs w:val="26"/>
         </w:rPr>
-        <w:t>a) Н_ЛЮДИ.ФАМИЛИЯ &lt; Ёлкин.</w:t>
+        <w:t xml:space="preserve">a) Н_ЛЮДИ.ФАМИЛИЯ </w:t>
+      </w:r>
+      <w:proofErr w:type="gramStart"/>
+      <w:r>
+        <w:rPr>
+          <w:rFonts w:ascii="Times New Roman" w:hAnsi="Times New Roman" w:cs="Times New Roman"/>
+          <w:sz w:val="26"/>
+          <w:szCs w:val="26"/>
+        </w:rPr>
+        <w:t>&lt; Ёлкин</w:t>
+      </w:r>
+      <w:proofErr w:type="gramEnd"/>
+      <w:r>
+        <w:rPr>
+          <w:rFonts w:ascii="Times New Roman" w:hAnsi="Times New Roman" w:cs="Times New Roman"/>
+          <w:sz w:val="26"/>
+          <w:szCs w:val="26"/>
+        </w:rPr>
+        <w:t>.</w:t>
       </w:r>
     </w:p>
     <w:p>
@@ -970,7 +1181,25 @@
           <w:sz w:val="26"/>
           <w:szCs w:val="26"/>
         </w:rPr>
-        <w:t>b) Н_СЕССИЯ.ЧЛВК_ИД &lt; 100012.</w:t>
+        <w:t xml:space="preserve">b) Н_СЕССИЯ.ЧЛВК_ИД </w:t>
+      </w:r>
+      <w:proofErr w:type="gramStart"/>
+      <w:r>
+        <w:rPr>
+          <w:rFonts w:ascii="Times New Roman" w:hAnsi="Times New Roman" w:cs="Times New Roman"/>
+          <w:sz w:val="26"/>
+          <w:szCs w:val="26"/>
+        </w:rPr>
+        <w:t>&lt; 100012</w:t>
+      </w:r>
+      <w:proofErr w:type="gramEnd"/>
+      <w:r>
+        <w:rPr>
+          <w:rFonts w:ascii="Times New Roman" w:hAnsi="Times New Roman" w:cs="Times New Roman"/>
+          <w:sz w:val="26"/>
+          <w:szCs w:val="26"/>
+        </w:rPr>
+        <w:t>.</w:t>
       </w:r>
     </w:p>
     <w:p>
@@ -1094,7 +1323,25 @@
           <w:sz w:val="26"/>
           <w:szCs w:val="26"/>
         </w:rPr>
-        <w:t>a) Н_ЛЮДИ.ИМЯ &lt; Владимир.</w:t>
+        <w:t xml:space="preserve">a) Н_ЛЮДИ.ИМЯ </w:t>
+      </w:r>
+      <w:proofErr w:type="gramStart"/>
+      <w:r>
+        <w:rPr>
+          <w:rFonts w:ascii="Times New Roman" w:hAnsi="Times New Roman" w:cs="Times New Roman"/>
+          <w:sz w:val="26"/>
+          <w:szCs w:val="26"/>
+        </w:rPr>
+        <w:t>&lt; Владимир</w:t>
+      </w:r>
+      <w:proofErr w:type="gramEnd"/>
+      <w:r>
+        <w:rPr>
+          <w:rFonts w:ascii="Times New Roman" w:hAnsi="Times New Roman" w:cs="Times New Roman"/>
+          <w:sz w:val="26"/>
+          <w:szCs w:val="26"/>
+        </w:rPr>
+        <w:t>.</w:t>
       </w:r>
     </w:p>
     <w:p>
@@ -1114,7 +1361,25 @@
           <w:sz w:val="26"/>
           <w:szCs w:val="26"/>
         </w:rPr>
-        <w:t>b) Н_ОБУЧЕНИЯ.НЗК &gt; 999080.</w:t>
+        <w:t>b) Н_</w:t>
+      </w:r>
+      <w:proofErr w:type="gramStart"/>
+      <w:r>
+        <w:rPr>
+          <w:rFonts w:ascii="Times New Roman" w:hAnsi="Times New Roman" w:cs="Times New Roman"/>
+          <w:sz w:val="26"/>
+          <w:szCs w:val="26"/>
+        </w:rPr>
+        <w:t>ОБУЧЕНИЯ.НЗК &gt;</w:t>
+      </w:r>
+      <w:proofErr w:type="gramEnd"/>
+      <w:r>
+        <w:rPr>
+          <w:rFonts w:ascii="Times New Roman" w:hAnsi="Times New Roman" w:cs="Times New Roman"/>
+          <w:sz w:val="26"/>
+          <w:szCs w:val="26"/>
+        </w:rPr>
+        <w:t xml:space="preserve"> 999080.</w:t>
       </w:r>
     </w:p>
     <w:p>
@@ -1134,7 +1399,25 @@
           <w:sz w:val="26"/>
           <w:szCs w:val="26"/>
         </w:rPr>
-        <w:t>c) Н_УЧЕНИКИ.ИД &lt; 1.</w:t>
+        <w:t xml:space="preserve">c) Н_УЧЕНИКИ.ИД </w:t>
+      </w:r>
+      <w:proofErr w:type="gramStart"/>
+      <w:r>
+        <w:rPr>
+          <w:rFonts w:ascii="Times New Roman" w:hAnsi="Times New Roman" w:cs="Times New Roman"/>
+          <w:sz w:val="26"/>
+          <w:szCs w:val="26"/>
+        </w:rPr>
+        <w:t>&lt; 1</w:t>
+      </w:r>
+      <w:proofErr w:type="gramEnd"/>
+      <w:r>
+        <w:rPr>
+          <w:rFonts w:ascii="Times New Roman" w:hAnsi="Times New Roman" w:cs="Times New Roman"/>
+          <w:sz w:val="26"/>
+          <w:szCs w:val="26"/>
+        </w:rPr>
+        <w:t>.</w:t>
       </w:r>
     </w:p>
     <w:p>
@@ -1160,112 +1443,3119 @@
     <w:p>
       <w:pPr>
         <w:rPr>
-          <w:lang w:val="en-US"/>
-        </w:rPr>
-      </w:pPr>
-    </w:p>
-    <w:p>
-      <w:pPr>
-        <w:rPr>
-          <w:lang w:val="en-US"/>
-        </w:rPr>
-      </w:pPr>
-    </w:p>
-    <w:p>
-      <w:pPr>
-        <w:rPr>
-          <w:lang w:val="en-US"/>
-        </w:rPr>
-      </w:pPr>
-    </w:p>
-    <w:p>
-      <w:pPr>
-        <w:rPr>
-          <w:lang w:val="en-US"/>
-        </w:rPr>
-      </w:pPr>
-    </w:p>
-    <w:p>
-      <w:pPr>
-        <w:rPr>
-          <w:lang w:val="en-US"/>
-        </w:rPr>
-      </w:pPr>
-      <w:r>
-        <w:rPr>
-          <w:lang w:val="en-US"/>
+          <w:rFonts w:ascii="Times New Roman" w:hAnsi="Times New Roman" w:cs="Times New Roman"/>
+        </w:rPr>
+      </w:pPr>
+    </w:p>
+    <w:p>
+      <w:pPr>
+        <w:rPr>
+          <w:rFonts w:ascii="Times New Roman" w:hAnsi="Times New Roman" w:cs="Times New Roman"/>
+        </w:rPr>
+      </w:pPr>
+    </w:p>
+    <w:p>
+      <w:pPr>
+        <w:rPr>
+          <w:rFonts w:ascii="Times New Roman" w:hAnsi="Times New Roman" w:cs="Times New Roman"/>
+        </w:rPr>
+      </w:pPr>
+    </w:p>
+    <w:p>
+      <w:pPr>
+        <w:pStyle w:val="a3"/>
+        <w:rPr>
+          <w:b/>
+          <w:bCs/>
+        </w:rPr>
+      </w:pPr>
+      <w:bookmarkStart w:id="1" w:name="_Toc231281403"/>
+      <w:r>
+        <w:rPr>
+          <w:b/>
+          <w:bCs/>
+        </w:rPr>
+        <w:lastRenderedPageBreak/>
+        <w:t>Запрос №1</w:t>
+      </w:r>
+      <w:bookmarkEnd w:id="1"/>
+    </w:p>
+    <w:p>
+      <w:pPr>
+        <w:spacing w:after="0"/>
+        <w:jc w:val="both"/>
+        <w:rPr>
+          <w:rFonts w:ascii="Times New Roman" w:hAnsi="Times New Roman" w:cs="Times New Roman"/>
+          <w:sz w:val="26"/>
+          <w:szCs w:val="26"/>
+        </w:rPr>
+      </w:pPr>
+      <w:r>
+        <w:rPr>
+          <w:rFonts w:ascii="Times New Roman" w:hAnsi="Times New Roman" w:cs="Times New Roman"/>
+          <w:sz w:val="26"/>
+          <w:szCs w:val="26"/>
+        </w:rPr>
+        <w:t>Сделать запрос для получения атрибутов из указанных таблиц, применив фильтры по указанным условиям:</w:t>
+      </w:r>
+    </w:p>
+    <w:p>
+      <w:pPr>
+        <w:spacing w:after="0"/>
+        <w:jc w:val="both"/>
+        <w:rPr>
+          <w:rFonts w:ascii="Times New Roman" w:hAnsi="Times New Roman" w:cs="Times New Roman"/>
+          <w:sz w:val="26"/>
+          <w:szCs w:val="26"/>
+        </w:rPr>
+      </w:pPr>
+      <w:r>
+        <w:rPr>
+          <w:rFonts w:ascii="Times New Roman" w:hAnsi="Times New Roman" w:cs="Times New Roman"/>
+          <w:sz w:val="26"/>
+          <w:szCs w:val="26"/>
+        </w:rPr>
+        <w:t>Таблицы: Н_ЛЮДИ, Н_СЕССИЯ.</w:t>
+      </w:r>
+    </w:p>
+    <w:p>
+      <w:pPr>
+        <w:spacing w:after="0"/>
+        <w:jc w:val="both"/>
+        <w:rPr>
+          <w:rFonts w:ascii="Times New Roman" w:hAnsi="Times New Roman" w:cs="Times New Roman"/>
+          <w:sz w:val="26"/>
+          <w:szCs w:val="26"/>
+        </w:rPr>
+      </w:pPr>
+      <w:r>
+        <w:rPr>
+          <w:rFonts w:ascii="Times New Roman" w:hAnsi="Times New Roman" w:cs="Times New Roman"/>
+          <w:sz w:val="26"/>
+          <w:szCs w:val="26"/>
+        </w:rPr>
+        <w:t>Вывести атрибуты: Н_ЛЮДИ.ОТЧЕСТВО, Н_СЕССИЯ.УЧГОД.</w:t>
+      </w:r>
+    </w:p>
+    <w:p>
+      <w:pPr>
+        <w:spacing w:after="0"/>
+        <w:jc w:val="both"/>
+        <w:rPr>
+          <w:rFonts w:ascii="Times New Roman" w:hAnsi="Times New Roman" w:cs="Times New Roman"/>
+          <w:sz w:val="26"/>
+          <w:szCs w:val="26"/>
+        </w:rPr>
+      </w:pPr>
+      <w:r>
+        <w:rPr>
+          <w:rFonts w:ascii="Times New Roman" w:hAnsi="Times New Roman" w:cs="Times New Roman"/>
+          <w:sz w:val="26"/>
+          <w:szCs w:val="26"/>
+        </w:rPr>
+        <w:t>Фильтры (AND):</w:t>
+      </w:r>
+    </w:p>
+    <w:p>
+      <w:pPr>
+        <w:spacing w:after="0"/>
+        <w:jc w:val="both"/>
+        <w:rPr>
+          <w:rFonts w:ascii="Times New Roman" w:hAnsi="Times New Roman" w:cs="Times New Roman"/>
+          <w:sz w:val="26"/>
+          <w:szCs w:val="26"/>
+        </w:rPr>
+      </w:pPr>
+      <w:r>
+        <w:rPr>
+          <w:rFonts w:ascii="Times New Roman" w:hAnsi="Times New Roman" w:cs="Times New Roman"/>
+          <w:sz w:val="26"/>
+          <w:szCs w:val="26"/>
+        </w:rPr>
+        <w:t xml:space="preserve">a) Н_ЛЮДИ.ФАМИЛИЯ </w:t>
+      </w:r>
+      <w:proofErr w:type="gramStart"/>
+      <w:r>
+        <w:rPr>
+          <w:rFonts w:ascii="Times New Roman" w:hAnsi="Times New Roman" w:cs="Times New Roman"/>
+          <w:sz w:val="26"/>
+          <w:szCs w:val="26"/>
+        </w:rPr>
+        <w:t>&lt; Ёлкин</w:t>
+      </w:r>
+      <w:proofErr w:type="gramEnd"/>
+      <w:r>
+        <w:rPr>
+          <w:rFonts w:ascii="Times New Roman" w:hAnsi="Times New Roman" w:cs="Times New Roman"/>
+          <w:sz w:val="26"/>
+          <w:szCs w:val="26"/>
+        </w:rPr>
+        <w:t>.</w:t>
+      </w:r>
+    </w:p>
+    <w:p>
+      <w:pPr>
+        <w:spacing w:after="0"/>
+        <w:jc w:val="both"/>
+        <w:rPr>
+          <w:rFonts w:ascii="Times New Roman" w:hAnsi="Times New Roman" w:cs="Times New Roman"/>
+          <w:sz w:val="26"/>
+          <w:szCs w:val="26"/>
+        </w:rPr>
+      </w:pPr>
+      <w:r>
+        <w:rPr>
+          <w:rFonts w:ascii="Times New Roman" w:hAnsi="Times New Roman" w:cs="Times New Roman"/>
+          <w:sz w:val="26"/>
+          <w:szCs w:val="26"/>
+        </w:rPr>
+        <w:t xml:space="preserve">b) Н_СЕССИЯ.ЧЛВК_ИД </w:t>
+      </w:r>
+      <w:proofErr w:type="gramStart"/>
+      <w:r>
+        <w:rPr>
+          <w:rFonts w:ascii="Times New Roman" w:hAnsi="Times New Roman" w:cs="Times New Roman"/>
+          <w:sz w:val="26"/>
+          <w:szCs w:val="26"/>
+        </w:rPr>
+        <w:t>&lt; 100012</w:t>
+      </w:r>
+      <w:proofErr w:type="gramEnd"/>
+      <w:r>
+        <w:rPr>
+          <w:rFonts w:ascii="Times New Roman" w:hAnsi="Times New Roman" w:cs="Times New Roman"/>
+          <w:sz w:val="26"/>
+          <w:szCs w:val="26"/>
+        </w:rPr>
+        <w:t>.</w:t>
+      </w:r>
+    </w:p>
+    <w:p>
+      <w:pPr>
+        <w:spacing w:after="0"/>
+        <w:jc w:val="both"/>
+        <w:rPr>
+          <w:rFonts w:ascii="Times New Roman" w:hAnsi="Times New Roman" w:cs="Times New Roman"/>
+          <w:sz w:val="26"/>
+          <w:szCs w:val="26"/>
+        </w:rPr>
+      </w:pPr>
+      <w:r>
+        <w:rPr>
+          <w:rFonts w:ascii="Times New Roman" w:hAnsi="Times New Roman" w:cs="Times New Roman"/>
+          <w:sz w:val="26"/>
+          <w:szCs w:val="26"/>
+        </w:rPr>
+        <w:t>Вид соединения: RIGHT JOIN.</w:t>
+      </w:r>
+    </w:p>
+    <w:p>
+      <w:pPr>
+        <w:spacing w:after="0"/>
+        <w:jc w:val="both"/>
+        <w:rPr>
+          <w:rFonts w:ascii="Times New Roman" w:hAnsi="Times New Roman" w:cs="Times New Roman"/>
+          <w:sz w:val="26"/>
+          <w:szCs w:val="26"/>
+        </w:rPr>
+      </w:pPr>
+    </w:p>
+    <w:p>
+      <w:pPr>
+        <w:spacing w:after="0"/>
+        <w:jc w:val="both"/>
+        <w:rPr>
+          <w:rFonts w:ascii="Times New Roman" w:hAnsi="Times New Roman" w:cs="Times New Roman"/>
+          <w:b/>
+          <w:bCs/>
+          <w:sz w:val="26"/>
+          <w:szCs w:val="26"/>
+        </w:rPr>
+      </w:pPr>
+      <w:r>
+        <w:rPr>
+          <w:rFonts w:ascii="Times New Roman" w:hAnsi="Times New Roman" w:cs="Times New Roman"/>
+          <w:b/>
+          <w:bCs/>
+          <w:sz w:val="26"/>
+          <w:szCs w:val="26"/>
+        </w:rPr>
+        <w:t>Запрос</w:t>
+      </w:r>
+      <w:r>
+        <w:rPr>
+          <w:rFonts w:ascii="Times New Roman" w:hAnsi="Times New Roman" w:cs="Times New Roman"/>
+          <w:b/>
+          <w:bCs/>
+          <w:sz w:val="26"/>
+          <w:szCs w:val="26"/>
+        </w:rPr>
+        <w:t>:</w:t>
+      </w:r>
+    </w:p>
+    <w:p>
+      <w:pPr>
+        <w:spacing w:after="0"/>
+        <w:rPr>
+          <w:rFonts w:ascii="Times New Roman" w:hAnsi="Times New Roman" w:cs="Times New Roman"/>
+          <w:sz w:val="26"/>
+          <w:szCs w:val="26"/>
+        </w:rPr>
+      </w:pPr>
+      <w:r>
+        <w:rPr>
+          <w:rFonts w:ascii="Times New Roman" w:hAnsi="Times New Roman" w:cs="Times New Roman"/>
+          <w:sz w:val="26"/>
+          <w:szCs w:val="26"/>
+          <w:lang w:val="en-US"/>
+        </w:rPr>
+        <w:t>SELECT</w:t>
+      </w:r>
+      <w:r>
+        <w:rPr>
+          <w:rFonts w:ascii="Times New Roman" w:hAnsi="Times New Roman" w:cs="Times New Roman"/>
+          <w:sz w:val="26"/>
+          <w:szCs w:val="26"/>
+        </w:rPr>
+        <w:t xml:space="preserve"> </w:t>
+      </w:r>
+      <w:r>
+        <w:rPr>
+          <w:rFonts w:ascii="Times New Roman" w:hAnsi="Times New Roman" w:cs="Times New Roman"/>
+          <w:sz w:val="26"/>
+          <w:szCs w:val="26"/>
+        </w:rPr>
+        <w:t>Н</w:t>
+      </w:r>
+      <w:r>
+        <w:rPr>
+          <w:rFonts w:ascii="Times New Roman" w:hAnsi="Times New Roman" w:cs="Times New Roman"/>
+          <w:sz w:val="26"/>
+          <w:szCs w:val="26"/>
+        </w:rPr>
+        <w:t>_</w:t>
+      </w:r>
+      <w:r>
+        <w:rPr>
+          <w:rFonts w:ascii="Times New Roman" w:hAnsi="Times New Roman" w:cs="Times New Roman"/>
+          <w:sz w:val="26"/>
+          <w:szCs w:val="26"/>
+        </w:rPr>
+        <w:t>ЛЮДИ</w:t>
+      </w:r>
+      <w:r>
+        <w:rPr>
+          <w:rFonts w:ascii="Times New Roman" w:hAnsi="Times New Roman" w:cs="Times New Roman"/>
+          <w:sz w:val="26"/>
+          <w:szCs w:val="26"/>
+        </w:rPr>
+        <w:t>.</w:t>
+      </w:r>
+      <w:r>
+        <w:rPr>
+          <w:rFonts w:ascii="Times New Roman" w:hAnsi="Times New Roman" w:cs="Times New Roman"/>
+          <w:sz w:val="26"/>
+          <w:szCs w:val="26"/>
+        </w:rPr>
+        <w:t>ОТЧЕСТВО</w:t>
+      </w:r>
+      <w:r>
+        <w:rPr>
+          <w:rFonts w:ascii="Times New Roman" w:hAnsi="Times New Roman" w:cs="Times New Roman"/>
+          <w:sz w:val="26"/>
+          <w:szCs w:val="26"/>
+        </w:rPr>
+        <w:t xml:space="preserve">, </w:t>
+      </w:r>
+      <w:r>
+        <w:rPr>
+          <w:rFonts w:ascii="Times New Roman" w:hAnsi="Times New Roman" w:cs="Times New Roman"/>
+          <w:sz w:val="26"/>
+          <w:szCs w:val="26"/>
+        </w:rPr>
+        <w:t>Н</w:t>
+      </w:r>
+      <w:r>
+        <w:rPr>
+          <w:rFonts w:ascii="Times New Roman" w:hAnsi="Times New Roman" w:cs="Times New Roman"/>
+          <w:sz w:val="26"/>
+          <w:szCs w:val="26"/>
+        </w:rPr>
+        <w:t>_</w:t>
+      </w:r>
+      <w:r>
+        <w:rPr>
+          <w:rFonts w:ascii="Times New Roman" w:hAnsi="Times New Roman" w:cs="Times New Roman"/>
+          <w:sz w:val="26"/>
+          <w:szCs w:val="26"/>
+        </w:rPr>
+        <w:t>СЕССИЯ</w:t>
+      </w:r>
+      <w:r>
+        <w:rPr>
+          <w:rFonts w:ascii="Times New Roman" w:hAnsi="Times New Roman" w:cs="Times New Roman"/>
+          <w:sz w:val="26"/>
+          <w:szCs w:val="26"/>
+        </w:rPr>
+        <w:t>.</w:t>
+      </w:r>
+      <w:r>
+        <w:rPr>
+          <w:rFonts w:ascii="Times New Roman" w:hAnsi="Times New Roman" w:cs="Times New Roman"/>
+          <w:sz w:val="26"/>
+          <w:szCs w:val="26"/>
+        </w:rPr>
+        <w:t>УЧГОД</w:t>
+      </w:r>
+      <w:r>
+        <w:rPr>
+          <w:rFonts w:ascii="Times New Roman" w:hAnsi="Times New Roman" w:cs="Times New Roman"/>
+          <w:sz w:val="26"/>
+          <w:szCs w:val="26"/>
+        </w:rPr>
+        <w:t xml:space="preserve"> </w:t>
+      </w:r>
+      <w:r>
+        <w:rPr>
+          <w:rFonts w:ascii="Times New Roman" w:hAnsi="Times New Roman" w:cs="Times New Roman"/>
+          <w:sz w:val="26"/>
+          <w:szCs w:val="26"/>
+        </w:rPr>
+        <w:br/>
+      </w:r>
+      <w:r>
+        <w:rPr>
+          <w:rFonts w:ascii="Times New Roman" w:hAnsi="Times New Roman" w:cs="Times New Roman"/>
+          <w:sz w:val="26"/>
+          <w:szCs w:val="26"/>
+          <w:lang w:val="en-US"/>
+        </w:rPr>
+        <w:t>FROM</w:t>
+      </w:r>
+      <w:r>
+        <w:rPr>
+          <w:rFonts w:ascii="Times New Roman" w:hAnsi="Times New Roman" w:cs="Times New Roman"/>
+          <w:sz w:val="26"/>
+          <w:szCs w:val="26"/>
+        </w:rPr>
+        <w:t xml:space="preserve"> </w:t>
+      </w:r>
+      <w:r>
+        <w:rPr>
+          <w:rFonts w:ascii="Times New Roman" w:hAnsi="Times New Roman" w:cs="Times New Roman"/>
+          <w:sz w:val="26"/>
+          <w:szCs w:val="26"/>
+        </w:rPr>
+        <w:t>Н</w:t>
+      </w:r>
+      <w:r>
+        <w:rPr>
+          <w:rFonts w:ascii="Times New Roman" w:hAnsi="Times New Roman" w:cs="Times New Roman"/>
+          <w:sz w:val="26"/>
+          <w:szCs w:val="26"/>
+        </w:rPr>
+        <w:t>_</w:t>
+      </w:r>
+      <w:r>
+        <w:rPr>
+          <w:rFonts w:ascii="Times New Roman" w:hAnsi="Times New Roman" w:cs="Times New Roman"/>
+          <w:sz w:val="26"/>
+          <w:szCs w:val="26"/>
+        </w:rPr>
+        <w:t>ЛЮДИ</w:t>
+      </w:r>
+      <w:r>
+        <w:rPr>
+          <w:rFonts w:ascii="Times New Roman" w:hAnsi="Times New Roman" w:cs="Times New Roman"/>
+          <w:sz w:val="26"/>
+          <w:szCs w:val="26"/>
+        </w:rPr>
+        <w:t xml:space="preserve"> </w:t>
+      </w:r>
+      <w:r>
+        <w:rPr>
+          <w:rFonts w:ascii="Times New Roman" w:hAnsi="Times New Roman" w:cs="Times New Roman"/>
+          <w:sz w:val="26"/>
+          <w:szCs w:val="26"/>
+        </w:rPr>
+        <w:br/>
+      </w:r>
+      <w:r>
+        <w:rPr>
+          <w:rFonts w:ascii="Times New Roman" w:hAnsi="Times New Roman" w:cs="Times New Roman"/>
+          <w:sz w:val="26"/>
+          <w:szCs w:val="26"/>
+          <w:lang w:val="en-US"/>
+        </w:rPr>
+        <w:t>RIGHT</w:t>
+      </w:r>
+      <w:r>
+        <w:rPr>
+          <w:rFonts w:ascii="Times New Roman" w:hAnsi="Times New Roman" w:cs="Times New Roman"/>
+          <w:sz w:val="26"/>
+          <w:szCs w:val="26"/>
+        </w:rPr>
+        <w:t xml:space="preserve"> </w:t>
+      </w:r>
+      <w:r>
+        <w:rPr>
+          <w:rFonts w:ascii="Times New Roman" w:hAnsi="Times New Roman" w:cs="Times New Roman"/>
+          <w:sz w:val="26"/>
+          <w:szCs w:val="26"/>
+          <w:lang w:val="en-US"/>
+        </w:rPr>
+        <w:t>JOIN</w:t>
+      </w:r>
+      <w:r>
+        <w:rPr>
+          <w:rFonts w:ascii="Times New Roman" w:hAnsi="Times New Roman" w:cs="Times New Roman"/>
+          <w:sz w:val="26"/>
+          <w:szCs w:val="26"/>
+        </w:rPr>
+        <w:t xml:space="preserve"> </w:t>
+      </w:r>
+      <w:r>
+        <w:rPr>
+          <w:rFonts w:ascii="Times New Roman" w:hAnsi="Times New Roman" w:cs="Times New Roman"/>
+          <w:sz w:val="26"/>
+          <w:szCs w:val="26"/>
+        </w:rPr>
+        <w:t>Н</w:t>
+      </w:r>
+      <w:r>
+        <w:rPr>
+          <w:rFonts w:ascii="Times New Roman" w:hAnsi="Times New Roman" w:cs="Times New Roman"/>
+          <w:sz w:val="26"/>
+          <w:szCs w:val="26"/>
+        </w:rPr>
+        <w:t>_</w:t>
+      </w:r>
+      <w:r>
+        <w:rPr>
+          <w:rFonts w:ascii="Times New Roman" w:hAnsi="Times New Roman" w:cs="Times New Roman"/>
+          <w:sz w:val="26"/>
+          <w:szCs w:val="26"/>
+        </w:rPr>
+        <w:t>СЕССИЯ</w:t>
+      </w:r>
+      <w:r>
+        <w:rPr>
+          <w:rFonts w:ascii="Times New Roman" w:hAnsi="Times New Roman" w:cs="Times New Roman"/>
+          <w:sz w:val="26"/>
+          <w:szCs w:val="26"/>
+        </w:rPr>
+        <w:t xml:space="preserve"> </w:t>
+      </w:r>
+      <w:r>
+        <w:rPr>
+          <w:rFonts w:ascii="Times New Roman" w:hAnsi="Times New Roman" w:cs="Times New Roman"/>
+          <w:sz w:val="26"/>
+          <w:szCs w:val="26"/>
+        </w:rPr>
+        <w:br/>
+      </w:r>
+      <w:r>
+        <w:rPr>
+          <w:rFonts w:ascii="Times New Roman" w:hAnsi="Times New Roman" w:cs="Times New Roman"/>
+          <w:sz w:val="26"/>
+          <w:szCs w:val="26"/>
+          <w:lang w:val="en-US"/>
+        </w:rPr>
+        <w:t>ON</w:t>
+      </w:r>
+      <w:r>
+        <w:rPr>
+          <w:rFonts w:ascii="Times New Roman" w:hAnsi="Times New Roman" w:cs="Times New Roman"/>
+          <w:sz w:val="26"/>
+          <w:szCs w:val="26"/>
+        </w:rPr>
+        <w:t xml:space="preserve"> </w:t>
+      </w:r>
+      <w:r>
+        <w:rPr>
+          <w:rFonts w:ascii="Times New Roman" w:hAnsi="Times New Roman" w:cs="Times New Roman"/>
+          <w:sz w:val="26"/>
+          <w:szCs w:val="26"/>
+        </w:rPr>
+        <w:t>Н</w:t>
+      </w:r>
+      <w:r>
+        <w:rPr>
+          <w:rFonts w:ascii="Times New Roman" w:hAnsi="Times New Roman" w:cs="Times New Roman"/>
+          <w:sz w:val="26"/>
+          <w:szCs w:val="26"/>
+        </w:rPr>
+        <w:t>_</w:t>
+      </w:r>
+      <w:r>
+        <w:rPr>
+          <w:rFonts w:ascii="Times New Roman" w:hAnsi="Times New Roman" w:cs="Times New Roman"/>
+          <w:sz w:val="26"/>
+          <w:szCs w:val="26"/>
+        </w:rPr>
+        <w:t>ЛЮДИ</w:t>
+      </w:r>
+      <w:r>
+        <w:rPr>
+          <w:rFonts w:ascii="Times New Roman" w:hAnsi="Times New Roman" w:cs="Times New Roman"/>
+          <w:sz w:val="26"/>
+          <w:szCs w:val="26"/>
+        </w:rPr>
+        <w:t>.</w:t>
+      </w:r>
+      <w:r>
+        <w:rPr>
+          <w:rFonts w:ascii="Times New Roman" w:hAnsi="Times New Roman" w:cs="Times New Roman"/>
+          <w:sz w:val="26"/>
+          <w:szCs w:val="26"/>
+        </w:rPr>
+        <w:t>ИД</w:t>
+      </w:r>
+      <w:r>
+        <w:rPr>
+          <w:rFonts w:ascii="Times New Roman" w:hAnsi="Times New Roman" w:cs="Times New Roman"/>
+          <w:sz w:val="26"/>
+          <w:szCs w:val="26"/>
+        </w:rPr>
+        <w:t xml:space="preserve"> = </w:t>
+      </w:r>
+      <w:r>
+        <w:rPr>
+          <w:rFonts w:ascii="Times New Roman" w:hAnsi="Times New Roman" w:cs="Times New Roman"/>
+          <w:sz w:val="26"/>
+          <w:szCs w:val="26"/>
+        </w:rPr>
+        <w:t>Н</w:t>
+      </w:r>
+      <w:r>
+        <w:rPr>
+          <w:rFonts w:ascii="Times New Roman" w:hAnsi="Times New Roman" w:cs="Times New Roman"/>
+          <w:sz w:val="26"/>
+          <w:szCs w:val="26"/>
+        </w:rPr>
+        <w:t>_</w:t>
+      </w:r>
+      <w:r>
+        <w:rPr>
+          <w:rFonts w:ascii="Times New Roman" w:hAnsi="Times New Roman" w:cs="Times New Roman"/>
+          <w:sz w:val="26"/>
+          <w:szCs w:val="26"/>
+        </w:rPr>
+        <w:t>СЕССИЯ</w:t>
+      </w:r>
+      <w:r>
+        <w:rPr>
+          <w:rFonts w:ascii="Times New Roman" w:hAnsi="Times New Roman" w:cs="Times New Roman"/>
+          <w:sz w:val="26"/>
+          <w:szCs w:val="26"/>
+        </w:rPr>
+        <w:t>.</w:t>
+      </w:r>
+      <w:r>
+        <w:rPr>
+          <w:rFonts w:ascii="Times New Roman" w:hAnsi="Times New Roman" w:cs="Times New Roman"/>
+          <w:sz w:val="26"/>
+          <w:szCs w:val="26"/>
+        </w:rPr>
+        <w:t>ЧЛВК</w:t>
+      </w:r>
+      <w:r>
+        <w:rPr>
+          <w:rFonts w:ascii="Times New Roman" w:hAnsi="Times New Roman" w:cs="Times New Roman"/>
+          <w:sz w:val="26"/>
+          <w:szCs w:val="26"/>
+        </w:rPr>
+        <w:t>_</w:t>
+      </w:r>
+      <w:r>
+        <w:rPr>
+          <w:rFonts w:ascii="Times New Roman" w:hAnsi="Times New Roman" w:cs="Times New Roman"/>
+          <w:sz w:val="26"/>
+          <w:szCs w:val="26"/>
+        </w:rPr>
+        <w:t>ИД</w:t>
+      </w:r>
+      <w:r>
+        <w:rPr>
+          <w:rFonts w:ascii="Times New Roman" w:hAnsi="Times New Roman" w:cs="Times New Roman"/>
+          <w:sz w:val="26"/>
+          <w:szCs w:val="26"/>
+        </w:rPr>
+        <w:t xml:space="preserve"> </w:t>
+      </w:r>
+      <w:r>
+        <w:rPr>
+          <w:rFonts w:ascii="Times New Roman" w:hAnsi="Times New Roman" w:cs="Times New Roman"/>
+          <w:sz w:val="26"/>
+          <w:szCs w:val="26"/>
+        </w:rPr>
+        <w:br/>
+      </w:r>
+      <w:r>
+        <w:rPr>
+          <w:rFonts w:ascii="Times New Roman" w:hAnsi="Times New Roman" w:cs="Times New Roman"/>
+          <w:sz w:val="26"/>
+          <w:szCs w:val="26"/>
+          <w:lang w:val="en-US"/>
+        </w:rPr>
+        <w:t>WHERE</w:t>
+      </w:r>
+      <w:r>
+        <w:rPr>
+          <w:rFonts w:ascii="Times New Roman" w:hAnsi="Times New Roman" w:cs="Times New Roman"/>
+          <w:sz w:val="26"/>
+          <w:szCs w:val="26"/>
+        </w:rPr>
+        <w:t xml:space="preserve"> </w:t>
+      </w:r>
+      <w:r>
+        <w:rPr>
+          <w:rFonts w:ascii="Times New Roman" w:hAnsi="Times New Roman" w:cs="Times New Roman"/>
+          <w:sz w:val="26"/>
+          <w:szCs w:val="26"/>
+        </w:rPr>
+        <w:t>Н</w:t>
+      </w:r>
+      <w:r>
+        <w:rPr>
+          <w:rFonts w:ascii="Times New Roman" w:hAnsi="Times New Roman" w:cs="Times New Roman"/>
+          <w:sz w:val="26"/>
+          <w:szCs w:val="26"/>
+        </w:rPr>
+        <w:t>_</w:t>
+      </w:r>
+      <w:r>
+        <w:rPr>
+          <w:rFonts w:ascii="Times New Roman" w:hAnsi="Times New Roman" w:cs="Times New Roman"/>
+          <w:sz w:val="26"/>
+          <w:szCs w:val="26"/>
+        </w:rPr>
+        <w:t>ЛЮДИ</w:t>
+      </w:r>
+      <w:r>
+        <w:rPr>
+          <w:rFonts w:ascii="Times New Roman" w:hAnsi="Times New Roman" w:cs="Times New Roman"/>
+          <w:sz w:val="26"/>
+          <w:szCs w:val="26"/>
+        </w:rPr>
+        <w:t>.</w:t>
+      </w:r>
+      <w:r>
+        <w:rPr>
+          <w:rFonts w:ascii="Times New Roman" w:hAnsi="Times New Roman" w:cs="Times New Roman"/>
+          <w:sz w:val="26"/>
+          <w:szCs w:val="26"/>
+        </w:rPr>
+        <w:t>ФАМИЛИЯ</w:t>
+      </w:r>
+      <w:r>
+        <w:rPr>
+          <w:rFonts w:ascii="Times New Roman" w:hAnsi="Times New Roman" w:cs="Times New Roman"/>
+          <w:sz w:val="26"/>
+          <w:szCs w:val="26"/>
+        </w:rPr>
+        <w:t xml:space="preserve"> &lt; '</w:t>
+      </w:r>
+      <w:r>
+        <w:rPr>
+          <w:rFonts w:ascii="Times New Roman" w:hAnsi="Times New Roman" w:cs="Times New Roman"/>
+          <w:sz w:val="26"/>
+          <w:szCs w:val="26"/>
+        </w:rPr>
+        <w:t>Ёлкин</w:t>
+      </w:r>
+      <w:r>
+        <w:rPr>
+          <w:rFonts w:ascii="Times New Roman" w:hAnsi="Times New Roman" w:cs="Times New Roman"/>
+          <w:sz w:val="26"/>
+          <w:szCs w:val="26"/>
+        </w:rPr>
+        <w:t xml:space="preserve">' </w:t>
+      </w:r>
+      <w:r>
+        <w:rPr>
+          <w:rFonts w:ascii="Times New Roman" w:hAnsi="Times New Roman" w:cs="Times New Roman"/>
+          <w:sz w:val="26"/>
+          <w:szCs w:val="26"/>
+          <w:lang w:val="en-US"/>
+        </w:rPr>
+        <w:t>AND</w:t>
+      </w:r>
+      <w:r>
+        <w:rPr>
+          <w:rFonts w:ascii="Times New Roman" w:hAnsi="Times New Roman" w:cs="Times New Roman"/>
+          <w:sz w:val="26"/>
+          <w:szCs w:val="26"/>
+        </w:rPr>
+        <w:t xml:space="preserve"> </w:t>
+      </w:r>
+      <w:r>
+        <w:rPr>
+          <w:rFonts w:ascii="Times New Roman" w:hAnsi="Times New Roman" w:cs="Times New Roman"/>
+          <w:sz w:val="26"/>
+          <w:szCs w:val="26"/>
+        </w:rPr>
+        <w:t>Н</w:t>
+      </w:r>
+      <w:r>
+        <w:rPr>
+          <w:rFonts w:ascii="Times New Roman" w:hAnsi="Times New Roman" w:cs="Times New Roman"/>
+          <w:sz w:val="26"/>
+          <w:szCs w:val="26"/>
+        </w:rPr>
+        <w:t>_</w:t>
+      </w:r>
+      <w:r>
+        <w:rPr>
+          <w:rFonts w:ascii="Times New Roman" w:hAnsi="Times New Roman" w:cs="Times New Roman"/>
+          <w:sz w:val="26"/>
+          <w:szCs w:val="26"/>
+        </w:rPr>
+        <w:t>СЕССИЯ</w:t>
+      </w:r>
+      <w:r>
+        <w:rPr>
+          <w:rFonts w:ascii="Times New Roman" w:hAnsi="Times New Roman" w:cs="Times New Roman"/>
+          <w:sz w:val="26"/>
+          <w:szCs w:val="26"/>
+        </w:rPr>
+        <w:t>.</w:t>
+      </w:r>
+      <w:r>
+        <w:rPr>
+          <w:rFonts w:ascii="Times New Roman" w:hAnsi="Times New Roman" w:cs="Times New Roman"/>
+          <w:sz w:val="26"/>
+          <w:szCs w:val="26"/>
+        </w:rPr>
+        <w:t>ЧЛВК</w:t>
+      </w:r>
+      <w:r>
+        <w:rPr>
+          <w:rFonts w:ascii="Times New Roman" w:hAnsi="Times New Roman" w:cs="Times New Roman"/>
+          <w:sz w:val="26"/>
+          <w:szCs w:val="26"/>
+        </w:rPr>
+        <w:t>_</w:t>
+      </w:r>
+      <w:r>
+        <w:rPr>
+          <w:rFonts w:ascii="Times New Roman" w:hAnsi="Times New Roman" w:cs="Times New Roman"/>
+          <w:sz w:val="26"/>
+          <w:szCs w:val="26"/>
+        </w:rPr>
+        <w:t>ИД</w:t>
+      </w:r>
+      <w:r>
+        <w:rPr>
+          <w:rFonts w:ascii="Times New Roman" w:hAnsi="Times New Roman" w:cs="Times New Roman"/>
+          <w:sz w:val="26"/>
+          <w:szCs w:val="26"/>
+        </w:rPr>
+        <w:t xml:space="preserve"> &lt; 100012;</w:t>
+      </w:r>
+    </w:p>
+    <w:p>
+      <w:pPr>
+        <w:rPr>
+          <w:rFonts w:ascii="Times New Roman" w:hAnsi="Times New Roman" w:cs="Times New Roman"/>
+          <w:b/>
+          <w:bCs/>
+        </w:rPr>
+      </w:pPr>
+    </w:p>
+    <w:p>
+      <w:pPr>
+        <w:rPr>
+          <w:rFonts w:ascii="Times New Roman" w:hAnsi="Times New Roman" w:cs="Times New Roman"/>
+          <w:b/>
+          <w:bCs/>
+        </w:rPr>
+      </w:pPr>
+      <w:r>
+        <w:rPr>
+          <w:rFonts w:ascii="Times New Roman" w:hAnsi="Times New Roman" w:cs="Times New Roman"/>
+          <w:b/>
+          <w:bCs/>
+        </w:rPr>
+        <w:t>Индексы:</w:t>
+      </w:r>
+    </w:p>
+    <w:p>
+      <w:pPr>
+        <w:rPr>
+          <w:rFonts w:ascii="Times New Roman" w:hAnsi="Times New Roman" w:cs="Times New Roman"/>
+        </w:rPr>
+      </w:pPr>
+      <w:r>
+        <w:rPr>
+          <w:rFonts w:ascii="Times New Roman" w:hAnsi="Times New Roman" w:cs="Times New Roman"/>
+        </w:rPr>
+        <w:t xml:space="preserve">Для ускорения выполнения данного запроса я бы использовал </w:t>
+      </w:r>
+      <w:r>
+        <w:rPr>
+          <w:rFonts w:ascii="Times New Roman" w:hAnsi="Times New Roman" w:cs="Times New Roman"/>
+          <w:lang w:val="en-US"/>
+        </w:rPr>
+        <w:t>B</w:t>
+      </w:r>
+      <w:r>
+        <w:rPr>
+          <w:rFonts w:ascii="Times New Roman" w:hAnsi="Times New Roman" w:cs="Times New Roman"/>
+        </w:rPr>
+        <w:t>-</w:t>
+      </w:r>
+      <w:r>
+        <w:rPr>
+          <w:rFonts w:ascii="Times New Roman" w:hAnsi="Times New Roman" w:cs="Times New Roman"/>
+          <w:lang w:val="en-US"/>
+        </w:rPr>
+        <w:t>tree</w:t>
+      </w:r>
+      <w:r>
+        <w:rPr>
+          <w:rFonts w:ascii="Times New Roman" w:hAnsi="Times New Roman" w:cs="Times New Roman"/>
+        </w:rPr>
+        <w:t xml:space="preserve"> индекс</w:t>
+      </w:r>
+      <w:r>
+        <w:rPr>
+          <w:rFonts w:ascii="Times New Roman" w:hAnsi="Times New Roman" w:cs="Times New Roman"/>
+        </w:rPr>
+        <w:t>ы для отношений Н_ЛЮДИ и Н_СЕССИЯ</w:t>
+      </w:r>
+      <w:r>
+        <w:rPr>
+          <w:rFonts w:ascii="Times New Roman" w:hAnsi="Times New Roman" w:cs="Times New Roman"/>
+        </w:rPr>
+        <w:t xml:space="preserve"> и атрибутов ФАМИЛИЯ и ЧЛВК_ИД соответственно. B</w:t>
+      </w:r>
+      <w:r>
+        <w:rPr>
+          <w:rFonts w:ascii="Times New Roman" w:hAnsi="Times New Roman" w:cs="Times New Roman"/>
+        </w:rPr>
+        <w:t>-</w:t>
+      </w:r>
+      <w:r>
+        <w:rPr>
+          <w:rFonts w:ascii="Times New Roman" w:hAnsi="Times New Roman" w:cs="Times New Roman"/>
+          <w:lang w:val="en-US"/>
+        </w:rPr>
+        <w:t>tree</w:t>
+      </w:r>
+      <w:r>
+        <w:rPr>
+          <w:rFonts w:ascii="Times New Roman" w:hAnsi="Times New Roman" w:cs="Times New Roman"/>
+        </w:rPr>
+        <w:t xml:space="preserve"> способен эффективно выбирать строки, основываясь на их положении в дереве. Также выбор </w:t>
+      </w:r>
+      <w:r>
+        <w:rPr>
+          <w:rFonts w:ascii="Times New Roman" w:hAnsi="Times New Roman" w:cs="Times New Roman"/>
+          <w:lang w:val="en-US"/>
+        </w:rPr>
+        <w:t>B</w:t>
+      </w:r>
+      <w:r>
+        <w:rPr>
+          <w:rFonts w:ascii="Times New Roman" w:hAnsi="Times New Roman" w:cs="Times New Roman"/>
+        </w:rPr>
+        <w:t>-</w:t>
+      </w:r>
+      <w:r>
+        <w:rPr>
+          <w:rFonts w:ascii="Times New Roman" w:hAnsi="Times New Roman" w:cs="Times New Roman"/>
+          <w:lang w:val="en-US"/>
+        </w:rPr>
+        <w:t>tree</w:t>
+      </w:r>
+      <w:r>
+        <w:rPr>
+          <w:rFonts w:ascii="Times New Roman" w:hAnsi="Times New Roman" w:cs="Times New Roman"/>
+        </w:rPr>
+        <w:t xml:space="preserve"> обусловлен тем, что </w:t>
+      </w:r>
+      <w:r>
+        <w:rPr>
+          <w:rFonts w:ascii="Times New Roman" w:hAnsi="Times New Roman" w:cs="Times New Roman"/>
+        </w:rPr>
+        <w:t xml:space="preserve">в запросе </w:t>
+      </w:r>
+      <w:r>
+        <w:rPr>
+          <w:rFonts w:ascii="Times New Roman" w:hAnsi="Times New Roman" w:cs="Times New Roman"/>
+        </w:rPr>
+        <w:t>используются операции сравнения.</w:t>
+      </w:r>
+    </w:p>
+    <w:p>
+      <w:pPr>
+        <w:rPr>
+          <w:rFonts w:ascii="Times New Roman" w:hAnsi="Times New Roman" w:cs="Times New Roman"/>
+        </w:rPr>
+      </w:pPr>
+      <w:r>
+        <w:rPr>
+          <w:rFonts w:ascii="Times New Roman" w:hAnsi="Times New Roman" w:cs="Times New Roman"/>
+        </w:rPr>
+        <w:t xml:space="preserve">CREATE INDEX </w:t>
+      </w:r>
+      <w:proofErr w:type="spellStart"/>
+      <w:r>
+        <w:rPr>
+          <w:rFonts w:ascii="Times New Roman" w:hAnsi="Times New Roman" w:cs="Times New Roman"/>
+        </w:rPr>
+        <w:t>idx_люди_фамилия</w:t>
+      </w:r>
+      <w:proofErr w:type="spellEnd"/>
+      <w:r>
+        <w:rPr>
+          <w:rFonts w:ascii="Times New Roman" w:hAnsi="Times New Roman" w:cs="Times New Roman"/>
+        </w:rPr>
+        <w:t xml:space="preserve"> ON Н_ЛЮДИ (ФАМИЛИЯ);</w:t>
+      </w:r>
+    </w:p>
+    <w:p>
+      <w:pPr>
+        <w:rPr>
+          <w:rFonts w:ascii="Times New Roman" w:hAnsi="Times New Roman" w:cs="Times New Roman"/>
+        </w:rPr>
+      </w:pPr>
+      <w:r>
+        <w:rPr>
+          <w:rFonts w:ascii="Times New Roman" w:hAnsi="Times New Roman" w:cs="Times New Roman"/>
+        </w:rPr>
+        <w:t xml:space="preserve">CREATE INDEX </w:t>
+      </w:r>
+      <w:proofErr w:type="spellStart"/>
+      <w:r>
+        <w:rPr>
+          <w:rFonts w:ascii="Times New Roman" w:hAnsi="Times New Roman" w:cs="Times New Roman"/>
+        </w:rPr>
+        <w:t>idx_сессия_члвк_ид</w:t>
+      </w:r>
+      <w:proofErr w:type="spellEnd"/>
+      <w:r>
+        <w:rPr>
+          <w:rFonts w:ascii="Times New Roman" w:hAnsi="Times New Roman" w:cs="Times New Roman"/>
+        </w:rPr>
+        <w:t xml:space="preserve"> ON Н_СЕССИЯ (ЧЛВК_ИД);</w:t>
+      </w:r>
+    </w:p>
+    <w:p>
+      <w:pPr>
+        <w:rPr>
+          <w:rFonts w:ascii="Times New Roman" w:hAnsi="Times New Roman" w:cs="Times New Roman"/>
+        </w:rPr>
+      </w:pPr>
+    </w:p>
+    <w:p>
+      <w:pPr>
+        <w:rPr>
+          <w:rFonts w:ascii="Times New Roman" w:hAnsi="Times New Roman" w:cs="Times New Roman"/>
+        </w:rPr>
+      </w:pPr>
+      <w:r>
+        <w:rPr>
+          <w:rFonts w:ascii="Times New Roman" w:hAnsi="Times New Roman" w:cs="Times New Roman"/>
+        </w:rPr>
+        <w:t xml:space="preserve">При добавлении индексов планы выполнения запросов </w:t>
+      </w:r>
+      <w:r>
+        <w:rPr>
+          <w:rFonts w:ascii="Times New Roman" w:hAnsi="Times New Roman" w:cs="Times New Roman"/>
+        </w:rPr>
+        <w:t>по</w:t>
+      </w:r>
+      <w:r>
+        <w:rPr>
+          <w:rFonts w:ascii="Times New Roman" w:hAnsi="Times New Roman" w:cs="Times New Roman"/>
+        </w:rPr>
+        <w:t xml:space="preserve">меняются. Вместо полного сканирования таблиц </w:t>
+      </w:r>
+      <w:r>
+        <w:rPr>
+          <w:rFonts w:ascii="Times New Roman" w:hAnsi="Times New Roman" w:cs="Times New Roman"/>
+        </w:rPr>
+        <w:t xml:space="preserve">будут </w:t>
+      </w:r>
+      <w:r>
+        <w:rPr>
+          <w:rFonts w:ascii="Times New Roman" w:hAnsi="Times New Roman" w:cs="Times New Roman"/>
+        </w:rPr>
+        <w:t>использ</w:t>
+      </w:r>
+      <w:r>
+        <w:rPr>
+          <w:rFonts w:ascii="Times New Roman" w:hAnsi="Times New Roman" w:cs="Times New Roman"/>
+        </w:rPr>
+        <w:t>ова</w:t>
+      </w:r>
+      <w:r>
+        <w:rPr>
+          <w:rFonts w:ascii="Times New Roman" w:hAnsi="Times New Roman" w:cs="Times New Roman"/>
+        </w:rPr>
+        <w:t>т</w:t>
+      </w:r>
+      <w:r>
+        <w:rPr>
+          <w:rFonts w:ascii="Times New Roman" w:hAnsi="Times New Roman" w:cs="Times New Roman"/>
+        </w:rPr>
+        <w:t>ь</w:t>
+      </w:r>
+      <w:r>
+        <w:rPr>
+          <w:rFonts w:ascii="Times New Roman" w:hAnsi="Times New Roman" w:cs="Times New Roman"/>
+        </w:rPr>
+        <w:t>ся индексные просмотры, благодаря чему сокращается количество считываемых страниц. Кроме того, типы соединений могут измениться</w:t>
+      </w:r>
+      <w:r>
+        <w:rPr>
+          <w:rFonts w:ascii="Times New Roman" w:hAnsi="Times New Roman" w:cs="Times New Roman"/>
+        </w:rPr>
+        <w:t>.</w:t>
+      </w:r>
+      <w:r>
+        <w:rPr>
+          <w:rFonts w:ascii="Times New Roman" w:hAnsi="Times New Roman" w:cs="Times New Roman"/>
+        </w:rPr>
+        <w:t xml:space="preserve"> В итоге общая стоимость выполнения запроса значительно уменьшается</w:t>
+      </w:r>
+      <w:r>
+        <w:rPr>
+          <w:rFonts w:ascii="Times New Roman" w:hAnsi="Times New Roman" w:cs="Times New Roman"/>
+        </w:rPr>
+        <w:t>.</w:t>
+      </w:r>
+    </w:p>
+    <w:p>
+      <w:pPr>
+        <w:rPr>
+          <w:rFonts w:ascii="Times New Roman" w:hAnsi="Times New Roman" w:cs="Times New Roman"/>
+          <w:b/>
+          <w:bCs/>
+          <w:lang w:val="en-US"/>
+        </w:rPr>
+      </w:pPr>
+      <w:r>
+        <w:rPr>
+          <w:rFonts w:ascii="Times New Roman" w:hAnsi="Times New Roman" w:cs="Times New Roman"/>
+          <w:b/>
+          <w:bCs/>
+          <w:lang w:val="en-US"/>
+        </w:rPr>
+        <w:t>EXPLAIN ANALYZE:</w:t>
+      </w:r>
+    </w:p>
+    <w:p>
+      <w:pPr>
+        <w:rPr>
+          <w:rFonts w:ascii="Times New Roman" w:hAnsi="Times New Roman" w:cs="Times New Roman"/>
+        </w:rPr>
+      </w:pPr>
+      <w:r>
+        <w:rPr>
+          <w:rFonts w:ascii="Times New Roman" w:hAnsi="Times New Roman" w:cs="Times New Roman"/>
+          <w:noProof/>
+        </w:rPr>
+        <w:drawing>
+          <wp:inline distT="0" distB="0" distL="0" distR="0" wp14:anchorId="40257208" wp14:editId="60C62918">
+            <wp:extent cx="5939790" cy="1188720"/>
+            <wp:effectExtent l="0" t="0" r="3810" b="0"/>
+            <wp:docPr id="1472686931" name="Рисунок 1"/>
+            <wp:cNvGraphicFramePr>
+              <a:graphicFrameLocks xmlns:a="http://schemas.openxmlformats.org/drawingml/2006/main" noChangeAspect="1"/>
+            </wp:cNvGraphicFramePr>
+            <a:graphic xmlns:a="http://schemas.openxmlformats.org/drawingml/2006/main">
+              <a:graphicData uri="http://schemas.openxmlformats.org/drawingml/2006/picture">
+                <pic:pic xmlns:pic="http://schemas.openxmlformats.org/drawingml/2006/picture">
+                  <pic:nvPicPr>
+                    <pic:cNvPr id="1472686931" name=""/>
+                    <pic:cNvPicPr/>
+                  </pic:nvPicPr>
+                  <pic:blipFill>
+                    <a:blip r:embed="rId8"/>
+                    <a:stretch>
+                      <a:fillRect/>
+                    </a:stretch>
+                  </pic:blipFill>
+                  <pic:spPr>
+                    <a:xfrm>
+                      <a:off x="0" y="0"/>
+                      <a:ext cx="5939790" cy="1188720"/>
+                    </a:xfrm>
+                    <a:prstGeom prst="rect">
+                      <a:avLst/>
+                    </a:prstGeom>
+                  </pic:spPr>
+                </pic:pic>
+              </a:graphicData>
+            </a:graphic>
+          </wp:inline>
+        </w:drawing>
+      </w:r>
+    </w:p>
+    <w:p>
+      <w:pPr>
+        <w:rPr>
+          <w:rFonts w:ascii="Times New Roman" w:hAnsi="Times New Roman" w:cs="Times New Roman"/>
+          <w:b/>
+          <w:bCs/>
+        </w:rPr>
+      </w:pPr>
+      <w:r>
+        <w:rPr>
+          <w:rFonts w:ascii="Times New Roman" w:hAnsi="Times New Roman" w:cs="Times New Roman"/>
+          <w:b/>
+          <w:bCs/>
+        </w:rPr>
+        <w:br w:type="page"/>
+      </w:r>
+    </w:p>
+    <w:p>
+      <w:pPr>
+        <w:rPr>
+          <w:rFonts w:ascii="Times New Roman" w:hAnsi="Times New Roman" w:cs="Times New Roman"/>
+          <w:b/>
+          <w:bCs/>
+        </w:rPr>
+      </w:pPr>
+      <w:r>
+        <w:rPr>
+          <w:rFonts w:ascii="Times New Roman" w:hAnsi="Times New Roman" w:cs="Times New Roman"/>
+          <w:b/>
+          <w:bCs/>
+        </w:rPr>
+        <w:lastRenderedPageBreak/>
+        <w:t>Планы выполнения запроса</w:t>
+      </w:r>
+    </w:p>
+    <w:p>
+      <w:pPr>
+        <w:rPr>
+          <w:rFonts w:ascii="Times New Roman" w:hAnsi="Times New Roman" w:cs="Times New Roman"/>
+          <w:sz w:val="28"/>
+          <w:szCs w:val="28"/>
+        </w:rPr>
+      </w:pPr>
+      <w:r>
+        <w:rPr>
+          <w:rFonts w:ascii="Times New Roman" w:hAnsi="Times New Roman" w:cs="Times New Roman"/>
+          <w:sz w:val="28"/>
+          <w:szCs w:val="28"/>
         </w:rPr>
         <w:t>1)</w:t>
       </w:r>
-      <w:r>
-        <w:rPr>
-          <w:lang w:val="en-US"/>
+    </w:p>
+    <w:p>
+      <w:pPr>
+        <w:rPr>
+          <w:rFonts w:ascii="Times New Roman" w:hAnsi="Times New Roman" w:cs="Times New Roman"/>
+          <w:sz w:val="28"/>
+          <w:szCs w:val="28"/>
+          <w:lang w:val="en-US"/>
+        </w:rPr>
+      </w:pPr>
+      <w:r>
+        <w:rPr>
+          <w:noProof/>
         </w:rPr>
         <w:t xml:space="preserve"> </w:t>
       </w:r>
       <w:r>
         <w:rPr>
-          <w:lang w:val="en-US"/>
-        </w:rPr>
-        <w:t>SELECT m.ОТЧЕСТВО, s.УЧГОД FROM (SELECT * FROM Н_ЛЮДИ WHERE Н_ЛЮДИ.ФАМИЛИЯ&lt;'Ёлкин') as m RIGHT JOIN (SELECT * FROM Н_СЕССИЯ WHERE ЧЛВК_ИД&lt;100012) as s ON s.ЧЛВК_ИД = m.ИД</w:t>
-      </w:r>
-    </w:p>
-    <w:p>
-      <w:r>
-        <w:rPr>
-          <w:lang w:val="en-US"/>
-        </w:rPr>
-        <w:t xml:space="preserve">2) </w:t>
-      </w:r>
-      <w:r>
-        <w:rPr>
-          <w:lang w:val="en-US"/>
-        </w:rPr>
-        <w:t>SELECT m.ОТЧЕСТВО, o.НЗК, u.ИД FROM (SELECT * FROM Н_ЛЮДИ WHERE Н_ЛЮДИ.ИМЯ&lt;'Владимир') as m LEFT JOIN (SELECT * FROM Н_ОБУЧЕНИЯ WHERE НЗК&gt;'999080') as o ON  m.ИД=o.ЧЛВК_ИД LEFT JOIN (SELECT * FROM Н_УЧЕНИКИ WHERE ИД&lt;1) as u ON u.ИД=o.ЧЛВК_ИД;</w:t>
-      </w:r>
-    </w:p>
-    <w:p>
-      <w:pPr>
-        <w:rPr>
-          <w:lang w:val="en-US"/>
-        </w:rPr>
-      </w:pPr>
-      <w:r>
-        <w:rPr>
-          <w:lang w:val="en-US"/>
-        </w:rPr>
-        <w:t>Todo cast + todo logic</w:t>
-      </w:r>
-      <w:r>
-        <w:rPr>
-          <w:lang w:val="en-US"/>
-        </w:rPr>
-        <w:t xml:space="preserve"> for 2</w:t>
-      </w:r>
-    </w:p>
-    <w:p>
-      <w:pPr>
-        <w:rPr>
-          <w:lang w:val="en-US"/>
-        </w:rPr>
-      </w:pPr>
-    </w:p>
-    <w:p>
-      <w:pPr>
-        <w:rPr>
-          <w:lang w:val="en-US"/>
-        </w:rPr>
-      </w:pPr>
-    </w:p>
-    <w:p>
-      <w:pPr>
-        <w:rPr>
-          <w:lang w:val="en-US"/>
-        </w:rPr>
-      </w:pPr>
+          <w:rFonts w:ascii="Times New Roman" w:hAnsi="Times New Roman" w:cs="Times New Roman"/>
+          <w:noProof/>
+          <w:sz w:val="28"/>
+          <w:szCs w:val="28"/>
+        </w:rPr>
+        <w:drawing>
+          <wp:inline distT="0" distB="0" distL="0" distR="0" wp14:anchorId="64B361CF" wp14:editId="5BF09A21">
+            <wp:extent cx="5104014" cy="4000709"/>
+            <wp:effectExtent l="0" t="0" r="1905" b="0"/>
+            <wp:docPr id="861349563" name="Рисунок 1"/>
+            <wp:cNvGraphicFramePr>
+              <a:graphicFrameLocks xmlns:a="http://schemas.openxmlformats.org/drawingml/2006/main" noChangeAspect="1"/>
+            </wp:cNvGraphicFramePr>
+            <a:graphic xmlns:a="http://schemas.openxmlformats.org/drawingml/2006/main">
+              <a:graphicData uri="http://schemas.openxmlformats.org/drawingml/2006/picture">
+                <pic:pic xmlns:pic="http://schemas.openxmlformats.org/drawingml/2006/picture">
+                  <pic:nvPicPr>
+                    <pic:cNvPr id="861349563" name=""/>
+                    <pic:cNvPicPr/>
+                  </pic:nvPicPr>
+                  <pic:blipFill>
+                    <a:blip r:embed="rId9"/>
+                    <a:stretch>
+                      <a:fillRect/>
+                    </a:stretch>
+                  </pic:blipFill>
+                  <pic:spPr>
+                    <a:xfrm>
+                      <a:off x="0" y="0"/>
+                      <a:ext cx="5107503" cy="4003444"/>
+                    </a:xfrm>
+                    <a:prstGeom prst="rect">
+                      <a:avLst/>
+                    </a:prstGeom>
+                  </pic:spPr>
+                </pic:pic>
+              </a:graphicData>
+            </a:graphic>
+          </wp:inline>
+        </w:drawing>
+      </w:r>
+    </w:p>
+    <w:p>
+      <w:pPr>
+        <w:rPr>
+          <w:rFonts w:ascii="Times New Roman" w:hAnsi="Times New Roman" w:cs="Times New Roman"/>
+          <w:sz w:val="28"/>
+          <w:szCs w:val="28"/>
+        </w:rPr>
+      </w:pPr>
+      <w:r>
+        <w:rPr>
+          <w:rFonts w:ascii="Times New Roman" w:hAnsi="Times New Roman" w:cs="Times New Roman"/>
+          <w:sz w:val="28"/>
+          <w:szCs w:val="28"/>
+        </w:rPr>
+        <w:t>2)</w:t>
+      </w:r>
+    </w:p>
+    <w:p>
+      <w:pPr>
+        <w:rPr>
+          <w:rFonts w:ascii="Times New Roman" w:hAnsi="Times New Roman" w:cs="Times New Roman"/>
+          <w:sz w:val="28"/>
+          <w:szCs w:val="28"/>
+        </w:rPr>
+      </w:pPr>
+      <w:r>
+        <w:rPr>
+          <w:noProof/>
+        </w:rPr>
+        <w:t xml:space="preserve"> </w:t>
+      </w:r>
+      <w:r>
+        <w:rPr>
+          <w:rFonts w:ascii="Times New Roman" w:hAnsi="Times New Roman" w:cs="Times New Roman"/>
+          <w:noProof/>
+          <w:sz w:val="28"/>
+          <w:szCs w:val="28"/>
+        </w:rPr>
+        <w:drawing>
+          <wp:inline distT="0" distB="0" distL="0" distR="0" wp14:anchorId="769EB547" wp14:editId="7823272D">
+            <wp:extent cx="4987636" cy="3887626"/>
+            <wp:effectExtent l="0" t="0" r="3810" b="0"/>
+            <wp:docPr id="1474882839" name="Рисунок 1"/>
+            <wp:cNvGraphicFramePr>
+              <a:graphicFrameLocks xmlns:a="http://schemas.openxmlformats.org/drawingml/2006/main" noChangeAspect="1"/>
+            </wp:cNvGraphicFramePr>
+            <a:graphic xmlns:a="http://schemas.openxmlformats.org/drawingml/2006/main">
+              <a:graphicData uri="http://schemas.openxmlformats.org/drawingml/2006/picture">
+                <pic:pic xmlns:pic="http://schemas.openxmlformats.org/drawingml/2006/picture">
+                  <pic:nvPicPr>
+                    <pic:cNvPr id="1474882839" name=""/>
+                    <pic:cNvPicPr/>
+                  </pic:nvPicPr>
+                  <pic:blipFill>
+                    <a:blip r:embed="rId10"/>
+                    <a:stretch>
+                      <a:fillRect/>
+                    </a:stretch>
+                  </pic:blipFill>
+                  <pic:spPr>
+                    <a:xfrm>
+                      <a:off x="0" y="0"/>
+                      <a:ext cx="4992182" cy="3891170"/>
+                    </a:xfrm>
+                    <a:prstGeom prst="rect">
+                      <a:avLst/>
+                    </a:prstGeom>
+                  </pic:spPr>
+                </pic:pic>
+              </a:graphicData>
+            </a:graphic>
+          </wp:inline>
+        </w:drawing>
+      </w:r>
+    </w:p>
+    <w:p>
+      <w:pPr>
+        <w:pStyle w:val="a3"/>
+        <w:rPr>
+          <w:b/>
+          <w:bCs/>
+        </w:rPr>
+      </w:pPr>
+      <w:bookmarkStart w:id="2" w:name="_Toc231281404"/>
+      <w:r>
+        <w:rPr>
+          <w:b/>
+          <w:bCs/>
+        </w:rPr>
+        <w:lastRenderedPageBreak/>
+        <w:t>Запрос №2</w:t>
+      </w:r>
+      <w:bookmarkEnd w:id="2"/>
+    </w:p>
+    <w:p>
+      <w:pPr>
+        <w:spacing w:after="0"/>
+        <w:jc w:val="both"/>
+        <w:rPr>
+          <w:rFonts w:ascii="Times New Roman" w:hAnsi="Times New Roman" w:cs="Times New Roman"/>
+          <w:sz w:val="26"/>
+          <w:szCs w:val="26"/>
+        </w:rPr>
+      </w:pPr>
+      <w:r>
+        <w:rPr>
+          <w:rFonts w:ascii="Times New Roman" w:hAnsi="Times New Roman" w:cs="Times New Roman"/>
+          <w:sz w:val="26"/>
+          <w:szCs w:val="26"/>
+        </w:rPr>
+        <w:t>Сделать запрос для получения атрибутов из указанных таблиц, применив фильтры по указанным условиям:</w:t>
+      </w:r>
+    </w:p>
+    <w:p>
+      <w:pPr>
+        <w:spacing w:after="0"/>
+        <w:jc w:val="both"/>
+        <w:rPr>
+          <w:rFonts w:ascii="Times New Roman" w:hAnsi="Times New Roman" w:cs="Times New Roman"/>
+          <w:sz w:val="26"/>
+          <w:szCs w:val="26"/>
+        </w:rPr>
+      </w:pPr>
+      <w:r>
+        <w:rPr>
+          <w:rFonts w:ascii="Times New Roman" w:hAnsi="Times New Roman" w:cs="Times New Roman"/>
+          <w:sz w:val="26"/>
+          <w:szCs w:val="26"/>
+        </w:rPr>
+        <w:t>Таблицы: Н_ЛЮДИ, Н_ОБУЧЕНИЯ, Н_УЧЕНИКИ.</w:t>
+      </w:r>
+    </w:p>
+    <w:p>
+      <w:pPr>
+        <w:spacing w:after="0"/>
+        <w:jc w:val="both"/>
+        <w:rPr>
+          <w:rFonts w:ascii="Times New Roman" w:hAnsi="Times New Roman" w:cs="Times New Roman"/>
+          <w:sz w:val="26"/>
+          <w:szCs w:val="26"/>
+        </w:rPr>
+      </w:pPr>
+      <w:r>
+        <w:rPr>
+          <w:rFonts w:ascii="Times New Roman" w:hAnsi="Times New Roman" w:cs="Times New Roman"/>
+          <w:sz w:val="26"/>
+          <w:szCs w:val="26"/>
+        </w:rPr>
+        <w:t>Вывести атрибуты: Н_ЛЮДИ.ОТЧЕСТВО, Н_ОБУЧЕНИЯ.НЗК, Н_УЧЕНИКИ.ИД.</w:t>
+      </w:r>
+    </w:p>
+    <w:p>
+      <w:pPr>
+        <w:spacing w:after="0"/>
+        <w:jc w:val="both"/>
+        <w:rPr>
+          <w:rFonts w:ascii="Times New Roman" w:hAnsi="Times New Roman" w:cs="Times New Roman"/>
+          <w:sz w:val="26"/>
+          <w:szCs w:val="26"/>
+        </w:rPr>
+      </w:pPr>
+      <w:r>
+        <w:rPr>
+          <w:rFonts w:ascii="Times New Roman" w:hAnsi="Times New Roman" w:cs="Times New Roman"/>
+          <w:sz w:val="26"/>
+          <w:szCs w:val="26"/>
+        </w:rPr>
+        <w:t>Фильтры: (AND)</w:t>
+      </w:r>
+    </w:p>
+    <w:p>
+      <w:pPr>
+        <w:spacing w:after="0"/>
+        <w:jc w:val="both"/>
+        <w:rPr>
+          <w:rFonts w:ascii="Times New Roman" w:hAnsi="Times New Roman" w:cs="Times New Roman"/>
+          <w:sz w:val="26"/>
+          <w:szCs w:val="26"/>
+        </w:rPr>
+      </w:pPr>
+      <w:r>
+        <w:rPr>
+          <w:rFonts w:ascii="Times New Roman" w:hAnsi="Times New Roman" w:cs="Times New Roman"/>
+          <w:sz w:val="26"/>
+          <w:szCs w:val="26"/>
+        </w:rPr>
+        <w:t xml:space="preserve">a) Н_ЛЮДИ.ИМЯ </w:t>
+      </w:r>
+      <w:proofErr w:type="gramStart"/>
+      <w:r>
+        <w:rPr>
+          <w:rFonts w:ascii="Times New Roman" w:hAnsi="Times New Roman" w:cs="Times New Roman"/>
+          <w:sz w:val="26"/>
+          <w:szCs w:val="26"/>
+        </w:rPr>
+        <w:t>&lt; Владимир</w:t>
+      </w:r>
+      <w:proofErr w:type="gramEnd"/>
+      <w:r>
+        <w:rPr>
+          <w:rFonts w:ascii="Times New Roman" w:hAnsi="Times New Roman" w:cs="Times New Roman"/>
+          <w:sz w:val="26"/>
+          <w:szCs w:val="26"/>
+        </w:rPr>
+        <w:t>.</w:t>
+      </w:r>
+    </w:p>
+    <w:p>
+      <w:pPr>
+        <w:spacing w:after="0"/>
+        <w:jc w:val="both"/>
+        <w:rPr>
+          <w:rFonts w:ascii="Times New Roman" w:hAnsi="Times New Roman" w:cs="Times New Roman"/>
+          <w:sz w:val="26"/>
+          <w:szCs w:val="26"/>
+        </w:rPr>
+      </w:pPr>
+      <w:r>
+        <w:rPr>
+          <w:rFonts w:ascii="Times New Roman" w:hAnsi="Times New Roman" w:cs="Times New Roman"/>
+          <w:sz w:val="26"/>
+          <w:szCs w:val="26"/>
+        </w:rPr>
+        <w:t>b) Н_</w:t>
+      </w:r>
+      <w:proofErr w:type="gramStart"/>
+      <w:r>
+        <w:rPr>
+          <w:rFonts w:ascii="Times New Roman" w:hAnsi="Times New Roman" w:cs="Times New Roman"/>
+          <w:sz w:val="26"/>
+          <w:szCs w:val="26"/>
+        </w:rPr>
+        <w:t>ОБУЧЕНИЯ.НЗК &gt;</w:t>
+      </w:r>
+      <w:proofErr w:type="gramEnd"/>
+      <w:r>
+        <w:rPr>
+          <w:rFonts w:ascii="Times New Roman" w:hAnsi="Times New Roman" w:cs="Times New Roman"/>
+          <w:sz w:val="26"/>
+          <w:szCs w:val="26"/>
+        </w:rPr>
+        <w:t xml:space="preserve"> 999080.</w:t>
+      </w:r>
+    </w:p>
+    <w:p>
+      <w:pPr>
+        <w:spacing w:after="0"/>
+        <w:jc w:val="both"/>
+        <w:rPr>
+          <w:rFonts w:ascii="Times New Roman" w:hAnsi="Times New Roman" w:cs="Times New Roman"/>
+          <w:sz w:val="26"/>
+          <w:szCs w:val="26"/>
+        </w:rPr>
+      </w:pPr>
+      <w:r>
+        <w:rPr>
+          <w:rFonts w:ascii="Times New Roman" w:hAnsi="Times New Roman" w:cs="Times New Roman"/>
+          <w:sz w:val="26"/>
+          <w:szCs w:val="26"/>
+        </w:rPr>
+        <w:t xml:space="preserve">c) Н_УЧЕНИКИ.ИД </w:t>
+      </w:r>
+      <w:proofErr w:type="gramStart"/>
+      <w:r>
+        <w:rPr>
+          <w:rFonts w:ascii="Times New Roman" w:hAnsi="Times New Roman" w:cs="Times New Roman"/>
+          <w:sz w:val="26"/>
+          <w:szCs w:val="26"/>
+        </w:rPr>
+        <w:t>&lt; 1</w:t>
+      </w:r>
+      <w:proofErr w:type="gramEnd"/>
+      <w:r>
+        <w:rPr>
+          <w:rFonts w:ascii="Times New Roman" w:hAnsi="Times New Roman" w:cs="Times New Roman"/>
+          <w:sz w:val="26"/>
+          <w:szCs w:val="26"/>
+        </w:rPr>
+        <w:t>.</w:t>
+      </w:r>
+    </w:p>
+    <w:p>
+      <w:pPr>
+        <w:spacing w:after="0"/>
+        <w:jc w:val="both"/>
+        <w:rPr>
+          <w:rFonts w:ascii="Times New Roman" w:hAnsi="Times New Roman" w:cs="Times New Roman"/>
+          <w:sz w:val="26"/>
+          <w:szCs w:val="26"/>
+        </w:rPr>
+      </w:pPr>
+      <w:r>
+        <w:rPr>
+          <w:rFonts w:ascii="Times New Roman" w:hAnsi="Times New Roman" w:cs="Times New Roman"/>
+          <w:sz w:val="26"/>
+          <w:szCs w:val="26"/>
+        </w:rPr>
+        <w:t>Вид соединения: LEFT JOIN.</w:t>
+      </w:r>
+    </w:p>
+    <w:p>
+      <w:pPr>
+        <w:spacing w:after="0"/>
+        <w:jc w:val="both"/>
+        <w:rPr>
+          <w:rFonts w:ascii="Times New Roman" w:hAnsi="Times New Roman" w:cs="Times New Roman"/>
+          <w:sz w:val="26"/>
+          <w:szCs w:val="26"/>
+        </w:rPr>
+      </w:pPr>
+    </w:p>
+    <w:p>
+      <w:pPr>
+        <w:spacing w:after="0"/>
+        <w:jc w:val="both"/>
+        <w:rPr>
+          <w:rFonts w:ascii="Times New Roman" w:hAnsi="Times New Roman" w:cs="Times New Roman"/>
+          <w:b/>
+          <w:bCs/>
+          <w:sz w:val="26"/>
+          <w:szCs w:val="26"/>
+        </w:rPr>
+      </w:pPr>
+      <w:r>
+        <w:rPr>
+          <w:rFonts w:ascii="Times New Roman" w:hAnsi="Times New Roman" w:cs="Times New Roman"/>
+          <w:b/>
+          <w:bCs/>
+          <w:sz w:val="26"/>
+          <w:szCs w:val="26"/>
+        </w:rPr>
+        <w:t>Запрос</w:t>
+      </w:r>
+      <w:r>
+        <w:rPr>
+          <w:rFonts w:ascii="Times New Roman" w:hAnsi="Times New Roman" w:cs="Times New Roman"/>
+          <w:b/>
+          <w:bCs/>
+          <w:sz w:val="26"/>
+          <w:szCs w:val="26"/>
+        </w:rPr>
+        <w:t>:</w:t>
+      </w:r>
+    </w:p>
+    <w:p>
+      <w:pPr>
+        <w:rPr>
+          <w:rFonts w:ascii="Times New Roman" w:hAnsi="Times New Roman" w:cs="Times New Roman"/>
+          <w:lang w:val="en-US"/>
+        </w:rPr>
+      </w:pPr>
+      <w:r>
+        <w:rPr>
+          <w:rFonts w:ascii="Times New Roman" w:hAnsi="Times New Roman" w:cs="Times New Roman"/>
+          <w:lang w:val="en-US"/>
+        </w:rPr>
+        <w:t xml:space="preserve">SELECT </w:t>
+      </w:r>
+      <w:r>
+        <w:rPr>
+          <w:rFonts w:ascii="Times New Roman" w:hAnsi="Times New Roman" w:cs="Times New Roman"/>
+        </w:rPr>
+        <w:t>Н</w:t>
+      </w:r>
+      <w:r>
+        <w:rPr>
+          <w:rFonts w:ascii="Times New Roman" w:hAnsi="Times New Roman" w:cs="Times New Roman"/>
+          <w:lang w:val="en-US"/>
+        </w:rPr>
+        <w:t>_</w:t>
+      </w:r>
+      <w:r>
+        <w:rPr>
+          <w:rFonts w:ascii="Times New Roman" w:hAnsi="Times New Roman" w:cs="Times New Roman"/>
+        </w:rPr>
+        <w:t>ЛЮДИ</w:t>
+      </w:r>
+      <w:r>
+        <w:rPr>
+          <w:rFonts w:ascii="Times New Roman" w:hAnsi="Times New Roman" w:cs="Times New Roman"/>
+          <w:lang w:val="en-US"/>
+        </w:rPr>
+        <w:t>.</w:t>
+      </w:r>
+      <w:r>
+        <w:rPr>
+          <w:rFonts w:ascii="Times New Roman" w:hAnsi="Times New Roman" w:cs="Times New Roman"/>
+        </w:rPr>
+        <w:t>ОТЧЕСТВО</w:t>
+      </w:r>
+      <w:r>
+        <w:rPr>
+          <w:rFonts w:ascii="Times New Roman" w:hAnsi="Times New Roman" w:cs="Times New Roman"/>
+          <w:lang w:val="en-US"/>
+        </w:rPr>
+        <w:t xml:space="preserve">, </w:t>
+      </w:r>
+      <w:r>
+        <w:rPr>
+          <w:rFonts w:ascii="Times New Roman" w:hAnsi="Times New Roman" w:cs="Times New Roman"/>
+        </w:rPr>
+        <w:t>Н</w:t>
+      </w:r>
+      <w:r>
+        <w:rPr>
+          <w:rFonts w:ascii="Times New Roman" w:hAnsi="Times New Roman" w:cs="Times New Roman"/>
+          <w:lang w:val="en-US"/>
+        </w:rPr>
+        <w:t>_</w:t>
+      </w:r>
+      <w:r>
+        <w:rPr>
+          <w:rFonts w:ascii="Times New Roman" w:hAnsi="Times New Roman" w:cs="Times New Roman"/>
+        </w:rPr>
+        <w:t>ОБУЧЕНИЯ</w:t>
+      </w:r>
+      <w:r>
+        <w:rPr>
+          <w:rFonts w:ascii="Times New Roman" w:hAnsi="Times New Roman" w:cs="Times New Roman"/>
+          <w:lang w:val="en-US"/>
+        </w:rPr>
+        <w:t>.</w:t>
+      </w:r>
+      <w:r>
+        <w:rPr>
+          <w:rFonts w:ascii="Times New Roman" w:hAnsi="Times New Roman" w:cs="Times New Roman"/>
+        </w:rPr>
+        <w:t>НЗК</w:t>
+      </w:r>
+      <w:r>
+        <w:rPr>
+          <w:rFonts w:ascii="Times New Roman" w:hAnsi="Times New Roman" w:cs="Times New Roman"/>
+          <w:lang w:val="en-US"/>
+        </w:rPr>
+        <w:t xml:space="preserve">, </w:t>
+      </w:r>
+      <w:r>
+        <w:rPr>
+          <w:rFonts w:ascii="Times New Roman" w:hAnsi="Times New Roman" w:cs="Times New Roman"/>
+        </w:rPr>
+        <w:t>Н</w:t>
+      </w:r>
+      <w:r>
+        <w:rPr>
+          <w:rFonts w:ascii="Times New Roman" w:hAnsi="Times New Roman" w:cs="Times New Roman"/>
+          <w:lang w:val="en-US"/>
+        </w:rPr>
+        <w:t>_</w:t>
+      </w:r>
+      <w:r>
+        <w:rPr>
+          <w:rFonts w:ascii="Times New Roman" w:hAnsi="Times New Roman" w:cs="Times New Roman"/>
+        </w:rPr>
+        <w:t>УЧЕНИКИ</w:t>
+      </w:r>
+      <w:r>
+        <w:rPr>
+          <w:rFonts w:ascii="Times New Roman" w:hAnsi="Times New Roman" w:cs="Times New Roman"/>
+          <w:lang w:val="en-US"/>
+        </w:rPr>
+        <w:t>.</w:t>
+      </w:r>
+      <w:r>
+        <w:rPr>
+          <w:rFonts w:ascii="Times New Roman" w:hAnsi="Times New Roman" w:cs="Times New Roman"/>
+        </w:rPr>
+        <w:t>ИД</w:t>
+      </w:r>
+      <w:r>
+        <w:rPr>
+          <w:rFonts w:ascii="Times New Roman" w:hAnsi="Times New Roman" w:cs="Times New Roman"/>
+          <w:lang w:val="en-US"/>
+        </w:rPr>
+        <w:t xml:space="preserve"> </w:t>
+      </w:r>
+      <w:r>
+        <w:rPr>
+          <w:rFonts w:ascii="Times New Roman" w:hAnsi="Times New Roman" w:cs="Times New Roman"/>
+          <w:lang w:val="en-US"/>
+        </w:rPr>
+        <w:br/>
+      </w:r>
+      <w:r>
+        <w:rPr>
+          <w:rFonts w:ascii="Times New Roman" w:hAnsi="Times New Roman" w:cs="Times New Roman"/>
+          <w:lang w:val="en-US"/>
+        </w:rPr>
+        <w:t xml:space="preserve">FROM </w:t>
+      </w:r>
+      <w:r>
+        <w:rPr>
+          <w:rFonts w:ascii="Times New Roman" w:hAnsi="Times New Roman" w:cs="Times New Roman"/>
+        </w:rPr>
+        <w:t>Н</w:t>
+      </w:r>
+      <w:r>
+        <w:rPr>
+          <w:rFonts w:ascii="Times New Roman" w:hAnsi="Times New Roman" w:cs="Times New Roman"/>
+          <w:lang w:val="en-US"/>
+        </w:rPr>
+        <w:t>_</w:t>
+      </w:r>
+      <w:r>
+        <w:rPr>
+          <w:rFonts w:ascii="Times New Roman" w:hAnsi="Times New Roman" w:cs="Times New Roman"/>
+        </w:rPr>
+        <w:t>ЛЮДИ</w:t>
+      </w:r>
+      <w:r>
+        <w:rPr>
+          <w:rFonts w:ascii="Times New Roman" w:hAnsi="Times New Roman" w:cs="Times New Roman"/>
+          <w:lang w:val="en-US"/>
+        </w:rPr>
+        <w:t xml:space="preserve"> </w:t>
+      </w:r>
+      <w:r>
+        <w:rPr>
+          <w:rFonts w:ascii="Times New Roman" w:hAnsi="Times New Roman" w:cs="Times New Roman"/>
+          <w:lang w:val="en-US"/>
+        </w:rPr>
+        <w:br/>
+      </w:r>
+      <w:r>
+        <w:rPr>
+          <w:rFonts w:ascii="Times New Roman" w:hAnsi="Times New Roman" w:cs="Times New Roman"/>
+          <w:lang w:val="en-US"/>
+        </w:rPr>
+        <w:t xml:space="preserve">LEFT JOIN </w:t>
+      </w:r>
+      <w:r>
+        <w:rPr>
+          <w:rFonts w:ascii="Times New Roman" w:hAnsi="Times New Roman" w:cs="Times New Roman"/>
+        </w:rPr>
+        <w:t>Н</w:t>
+      </w:r>
+      <w:r>
+        <w:rPr>
+          <w:rFonts w:ascii="Times New Roman" w:hAnsi="Times New Roman" w:cs="Times New Roman"/>
+          <w:lang w:val="en-US"/>
+        </w:rPr>
+        <w:t>_</w:t>
+      </w:r>
+      <w:r>
+        <w:rPr>
+          <w:rFonts w:ascii="Times New Roman" w:hAnsi="Times New Roman" w:cs="Times New Roman"/>
+        </w:rPr>
+        <w:t>ОБУЧЕНИЯ</w:t>
+      </w:r>
+      <w:r>
+        <w:rPr>
+          <w:rFonts w:ascii="Times New Roman" w:hAnsi="Times New Roman" w:cs="Times New Roman"/>
+          <w:lang w:val="en-US"/>
+        </w:rPr>
+        <w:t xml:space="preserve"> </w:t>
+      </w:r>
+      <w:r>
+        <w:rPr>
+          <w:rFonts w:ascii="Times New Roman" w:hAnsi="Times New Roman" w:cs="Times New Roman"/>
+          <w:lang w:val="en-US"/>
+        </w:rPr>
+        <w:br/>
+      </w:r>
+      <w:r>
+        <w:rPr>
+          <w:rFonts w:ascii="Times New Roman" w:hAnsi="Times New Roman" w:cs="Times New Roman"/>
+          <w:lang w:val="en-US"/>
+        </w:rPr>
+        <w:t xml:space="preserve">ON </w:t>
+      </w:r>
+      <w:r>
+        <w:rPr>
+          <w:rFonts w:ascii="Times New Roman" w:hAnsi="Times New Roman" w:cs="Times New Roman"/>
+        </w:rPr>
+        <w:t>Н</w:t>
+      </w:r>
+      <w:r>
+        <w:rPr>
+          <w:rFonts w:ascii="Times New Roman" w:hAnsi="Times New Roman" w:cs="Times New Roman"/>
+          <w:lang w:val="en-US"/>
+        </w:rPr>
+        <w:t>_</w:t>
+      </w:r>
+      <w:r>
+        <w:rPr>
+          <w:rFonts w:ascii="Times New Roman" w:hAnsi="Times New Roman" w:cs="Times New Roman"/>
+        </w:rPr>
+        <w:t>ЛЮДИ</w:t>
+      </w:r>
+      <w:r>
+        <w:rPr>
+          <w:rFonts w:ascii="Times New Roman" w:hAnsi="Times New Roman" w:cs="Times New Roman"/>
+          <w:lang w:val="en-US"/>
+        </w:rPr>
+        <w:t>.</w:t>
+      </w:r>
+      <w:r>
+        <w:rPr>
+          <w:rFonts w:ascii="Times New Roman" w:hAnsi="Times New Roman" w:cs="Times New Roman"/>
+        </w:rPr>
+        <w:t>ИД</w:t>
+      </w:r>
+      <w:r>
+        <w:rPr>
+          <w:rFonts w:ascii="Times New Roman" w:hAnsi="Times New Roman" w:cs="Times New Roman"/>
+          <w:lang w:val="en-US"/>
+        </w:rPr>
+        <w:t xml:space="preserve"> = </w:t>
+      </w:r>
+      <w:r>
+        <w:rPr>
+          <w:rFonts w:ascii="Times New Roman" w:hAnsi="Times New Roman" w:cs="Times New Roman"/>
+        </w:rPr>
+        <w:t>Н</w:t>
+      </w:r>
+      <w:r>
+        <w:rPr>
+          <w:rFonts w:ascii="Times New Roman" w:hAnsi="Times New Roman" w:cs="Times New Roman"/>
+          <w:lang w:val="en-US"/>
+        </w:rPr>
+        <w:t>_</w:t>
+      </w:r>
+      <w:r>
+        <w:rPr>
+          <w:rFonts w:ascii="Times New Roman" w:hAnsi="Times New Roman" w:cs="Times New Roman"/>
+        </w:rPr>
+        <w:t>ОБУЧЕНИЯ</w:t>
+      </w:r>
+      <w:r>
+        <w:rPr>
+          <w:rFonts w:ascii="Times New Roman" w:hAnsi="Times New Roman" w:cs="Times New Roman"/>
+          <w:lang w:val="en-US"/>
+        </w:rPr>
+        <w:t>.</w:t>
+      </w:r>
+      <w:r>
+        <w:rPr>
+          <w:rFonts w:ascii="Times New Roman" w:hAnsi="Times New Roman" w:cs="Times New Roman"/>
+        </w:rPr>
+        <w:t>ЧЛВК</w:t>
+      </w:r>
+      <w:r>
+        <w:rPr>
+          <w:rFonts w:ascii="Times New Roman" w:hAnsi="Times New Roman" w:cs="Times New Roman"/>
+          <w:lang w:val="en-US"/>
+        </w:rPr>
+        <w:t>_</w:t>
+      </w:r>
+      <w:r>
+        <w:rPr>
+          <w:rFonts w:ascii="Times New Roman" w:hAnsi="Times New Roman" w:cs="Times New Roman"/>
+        </w:rPr>
+        <w:t>ИД</w:t>
+      </w:r>
+      <w:r>
+        <w:rPr>
+          <w:rFonts w:ascii="Times New Roman" w:hAnsi="Times New Roman" w:cs="Times New Roman"/>
+          <w:lang w:val="en-US"/>
+        </w:rPr>
+        <w:t xml:space="preserve"> </w:t>
+      </w:r>
+      <w:r>
+        <w:rPr>
+          <w:rFonts w:ascii="Times New Roman" w:hAnsi="Times New Roman" w:cs="Times New Roman"/>
+          <w:lang w:val="en-US"/>
+        </w:rPr>
+        <w:br/>
+      </w:r>
+      <w:r>
+        <w:rPr>
+          <w:rFonts w:ascii="Times New Roman" w:hAnsi="Times New Roman" w:cs="Times New Roman"/>
+          <w:lang w:val="en-US"/>
+        </w:rPr>
+        <w:t xml:space="preserve">LEFT JOIN </w:t>
+      </w:r>
+      <w:r>
+        <w:rPr>
+          <w:rFonts w:ascii="Times New Roman" w:hAnsi="Times New Roman" w:cs="Times New Roman"/>
+        </w:rPr>
+        <w:t>Н</w:t>
+      </w:r>
+      <w:r>
+        <w:rPr>
+          <w:rFonts w:ascii="Times New Roman" w:hAnsi="Times New Roman" w:cs="Times New Roman"/>
+          <w:lang w:val="en-US"/>
+        </w:rPr>
+        <w:t>_</w:t>
+      </w:r>
+      <w:r>
+        <w:rPr>
+          <w:rFonts w:ascii="Times New Roman" w:hAnsi="Times New Roman" w:cs="Times New Roman"/>
+        </w:rPr>
+        <w:t>УЧЕНИКИ</w:t>
+      </w:r>
+      <w:r>
+        <w:rPr>
+          <w:rFonts w:ascii="Times New Roman" w:hAnsi="Times New Roman" w:cs="Times New Roman"/>
+          <w:lang w:val="en-US"/>
+        </w:rPr>
+        <w:t xml:space="preserve"> </w:t>
+      </w:r>
+      <w:r>
+        <w:rPr>
+          <w:rFonts w:ascii="Times New Roman" w:hAnsi="Times New Roman" w:cs="Times New Roman"/>
+          <w:lang w:val="en-US"/>
+        </w:rPr>
+        <w:br/>
+      </w:r>
+      <w:r>
+        <w:rPr>
+          <w:rFonts w:ascii="Times New Roman" w:hAnsi="Times New Roman" w:cs="Times New Roman"/>
+          <w:lang w:val="en-US"/>
+        </w:rPr>
+        <w:t xml:space="preserve">ON </w:t>
+      </w:r>
+      <w:r>
+        <w:rPr>
+          <w:rFonts w:ascii="Times New Roman" w:hAnsi="Times New Roman" w:cs="Times New Roman"/>
+        </w:rPr>
+        <w:t>Н</w:t>
+      </w:r>
+      <w:r>
+        <w:rPr>
+          <w:rFonts w:ascii="Times New Roman" w:hAnsi="Times New Roman" w:cs="Times New Roman"/>
+          <w:lang w:val="en-US"/>
+        </w:rPr>
+        <w:t>_</w:t>
+      </w:r>
+      <w:r>
+        <w:rPr>
+          <w:rFonts w:ascii="Times New Roman" w:hAnsi="Times New Roman" w:cs="Times New Roman"/>
+        </w:rPr>
+        <w:t>ЛЮДИ</w:t>
+      </w:r>
+      <w:r>
+        <w:rPr>
+          <w:rFonts w:ascii="Times New Roman" w:hAnsi="Times New Roman" w:cs="Times New Roman"/>
+          <w:lang w:val="en-US"/>
+        </w:rPr>
+        <w:t>.</w:t>
+      </w:r>
+      <w:r>
+        <w:rPr>
+          <w:rFonts w:ascii="Times New Roman" w:hAnsi="Times New Roman" w:cs="Times New Roman"/>
+        </w:rPr>
+        <w:t>ИД</w:t>
+      </w:r>
+      <w:r>
+        <w:rPr>
+          <w:rFonts w:ascii="Times New Roman" w:hAnsi="Times New Roman" w:cs="Times New Roman"/>
+          <w:lang w:val="en-US"/>
+        </w:rPr>
+        <w:t xml:space="preserve"> = </w:t>
+      </w:r>
+      <w:r>
+        <w:rPr>
+          <w:rFonts w:ascii="Times New Roman" w:hAnsi="Times New Roman" w:cs="Times New Roman"/>
+        </w:rPr>
+        <w:t>Н</w:t>
+      </w:r>
+      <w:r>
+        <w:rPr>
+          <w:rFonts w:ascii="Times New Roman" w:hAnsi="Times New Roman" w:cs="Times New Roman"/>
+          <w:lang w:val="en-US"/>
+        </w:rPr>
+        <w:t>_</w:t>
+      </w:r>
+      <w:r>
+        <w:rPr>
+          <w:rFonts w:ascii="Times New Roman" w:hAnsi="Times New Roman" w:cs="Times New Roman"/>
+        </w:rPr>
+        <w:t>УЧЕНИКИ</w:t>
+      </w:r>
+      <w:r>
+        <w:rPr>
+          <w:rFonts w:ascii="Times New Roman" w:hAnsi="Times New Roman" w:cs="Times New Roman"/>
+          <w:lang w:val="en-US"/>
+        </w:rPr>
+        <w:t>.</w:t>
+      </w:r>
+      <w:r>
+        <w:rPr>
+          <w:rFonts w:ascii="Times New Roman" w:hAnsi="Times New Roman" w:cs="Times New Roman"/>
+        </w:rPr>
+        <w:t>ЧЛВК</w:t>
+      </w:r>
+      <w:r>
+        <w:rPr>
+          <w:rFonts w:ascii="Times New Roman" w:hAnsi="Times New Roman" w:cs="Times New Roman"/>
+          <w:lang w:val="en-US"/>
+        </w:rPr>
+        <w:t>_</w:t>
+      </w:r>
+      <w:r>
+        <w:rPr>
+          <w:rFonts w:ascii="Times New Roman" w:hAnsi="Times New Roman" w:cs="Times New Roman"/>
+        </w:rPr>
+        <w:t>ИД</w:t>
+      </w:r>
+      <w:r>
+        <w:rPr>
+          <w:rFonts w:ascii="Times New Roman" w:hAnsi="Times New Roman" w:cs="Times New Roman"/>
+          <w:lang w:val="en-US"/>
+        </w:rPr>
+        <w:t xml:space="preserve"> </w:t>
+      </w:r>
+      <w:r>
+        <w:rPr>
+          <w:rFonts w:ascii="Times New Roman" w:hAnsi="Times New Roman" w:cs="Times New Roman"/>
+          <w:lang w:val="en-US"/>
+        </w:rPr>
+        <w:br/>
+      </w:r>
+      <w:r>
+        <w:rPr>
+          <w:rFonts w:ascii="Times New Roman" w:hAnsi="Times New Roman" w:cs="Times New Roman"/>
+          <w:lang w:val="en-US"/>
+        </w:rPr>
+        <w:t xml:space="preserve">WHERE </w:t>
+      </w:r>
+      <w:r>
+        <w:rPr>
+          <w:rFonts w:ascii="Times New Roman" w:hAnsi="Times New Roman" w:cs="Times New Roman"/>
+        </w:rPr>
+        <w:t>Н</w:t>
+      </w:r>
+      <w:r>
+        <w:rPr>
+          <w:rFonts w:ascii="Times New Roman" w:hAnsi="Times New Roman" w:cs="Times New Roman"/>
+          <w:lang w:val="en-US"/>
+        </w:rPr>
+        <w:t>_</w:t>
+      </w:r>
+      <w:r>
+        <w:rPr>
+          <w:rFonts w:ascii="Times New Roman" w:hAnsi="Times New Roman" w:cs="Times New Roman"/>
+        </w:rPr>
+        <w:t>ЛЮДИ</w:t>
+      </w:r>
+      <w:r>
+        <w:rPr>
+          <w:rFonts w:ascii="Times New Roman" w:hAnsi="Times New Roman" w:cs="Times New Roman"/>
+          <w:lang w:val="en-US"/>
+        </w:rPr>
+        <w:t>.</w:t>
+      </w:r>
+      <w:r>
+        <w:rPr>
+          <w:rFonts w:ascii="Times New Roman" w:hAnsi="Times New Roman" w:cs="Times New Roman"/>
+        </w:rPr>
+        <w:t>ИМЯ</w:t>
+      </w:r>
+      <w:r>
+        <w:rPr>
+          <w:rFonts w:ascii="Times New Roman" w:hAnsi="Times New Roman" w:cs="Times New Roman"/>
+          <w:lang w:val="en-US"/>
+        </w:rPr>
+        <w:t xml:space="preserve"> &lt; '</w:t>
+      </w:r>
+      <w:r>
+        <w:rPr>
+          <w:rFonts w:ascii="Times New Roman" w:hAnsi="Times New Roman" w:cs="Times New Roman"/>
+        </w:rPr>
+        <w:t>Владимир</w:t>
+      </w:r>
+      <w:r>
+        <w:rPr>
+          <w:rFonts w:ascii="Times New Roman" w:hAnsi="Times New Roman" w:cs="Times New Roman"/>
+          <w:lang w:val="en-US"/>
+        </w:rPr>
+        <w:t xml:space="preserve">' AND </w:t>
+      </w:r>
+      <w:proofErr w:type="gramStart"/>
+      <w:r>
+        <w:rPr>
+          <w:rFonts w:ascii="Times New Roman" w:hAnsi="Times New Roman" w:cs="Times New Roman"/>
+          <w:lang w:val="en-US"/>
+        </w:rPr>
+        <w:t>CAST</w:t>
+      </w:r>
+      <w:proofErr w:type="gramEnd"/>
+      <w:r>
+        <w:rPr>
+          <w:rFonts w:ascii="Times New Roman" w:hAnsi="Times New Roman" w:cs="Times New Roman"/>
+          <w:lang w:val="en-US"/>
+        </w:rPr>
+        <w:t xml:space="preserve"> </w:t>
+      </w:r>
+      <w:proofErr w:type="gramStart"/>
+      <w:r>
+        <w:rPr>
+          <w:rFonts w:ascii="Times New Roman" w:hAnsi="Times New Roman" w:cs="Times New Roman"/>
+          <w:lang w:val="en-US"/>
+        </w:rPr>
+        <w:t>(</w:t>
+      </w:r>
+      <w:proofErr w:type="gramEnd"/>
+      <w:r>
+        <w:rPr>
+          <w:rFonts w:ascii="Times New Roman" w:hAnsi="Times New Roman" w:cs="Times New Roman"/>
+        </w:rPr>
+        <w:t>Н</w:t>
+      </w:r>
+      <w:r>
+        <w:rPr>
+          <w:rFonts w:ascii="Times New Roman" w:hAnsi="Times New Roman" w:cs="Times New Roman"/>
+          <w:lang w:val="en-US"/>
+        </w:rPr>
+        <w:t>_</w:t>
+      </w:r>
+      <w:r>
+        <w:rPr>
+          <w:rFonts w:ascii="Times New Roman" w:hAnsi="Times New Roman" w:cs="Times New Roman"/>
+        </w:rPr>
+        <w:t>ОБУЧЕНИЯ</w:t>
+      </w:r>
+      <w:r>
+        <w:rPr>
+          <w:rFonts w:ascii="Times New Roman" w:hAnsi="Times New Roman" w:cs="Times New Roman"/>
+          <w:lang w:val="en-US"/>
+        </w:rPr>
+        <w:t>.</w:t>
+      </w:r>
+      <w:r>
+        <w:rPr>
+          <w:rFonts w:ascii="Times New Roman" w:hAnsi="Times New Roman" w:cs="Times New Roman"/>
+        </w:rPr>
+        <w:t>НЗК</w:t>
+      </w:r>
+      <w:r>
+        <w:rPr>
+          <w:rFonts w:ascii="Times New Roman" w:hAnsi="Times New Roman" w:cs="Times New Roman"/>
+          <w:lang w:val="en-US"/>
+        </w:rPr>
+        <w:t xml:space="preserve"> AS INTEGER) &gt; 999080 AND </w:t>
+      </w:r>
+      <w:r>
+        <w:rPr>
+          <w:rFonts w:ascii="Times New Roman" w:hAnsi="Times New Roman" w:cs="Times New Roman"/>
+        </w:rPr>
+        <w:t>Н</w:t>
+      </w:r>
+      <w:r>
+        <w:rPr>
+          <w:rFonts w:ascii="Times New Roman" w:hAnsi="Times New Roman" w:cs="Times New Roman"/>
+          <w:lang w:val="en-US"/>
+        </w:rPr>
+        <w:t>_</w:t>
+      </w:r>
+      <w:r>
+        <w:rPr>
+          <w:rFonts w:ascii="Times New Roman" w:hAnsi="Times New Roman" w:cs="Times New Roman"/>
+        </w:rPr>
+        <w:t>УЧЕНИКИ</w:t>
+      </w:r>
+      <w:r>
+        <w:rPr>
+          <w:rFonts w:ascii="Times New Roman" w:hAnsi="Times New Roman" w:cs="Times New Roman"/>
+          <w:lang w:val="en-US"/>
+        </w:rPr>
+        <w:t>.</w:t>
+      </w:r>
+      <w:r>
+        <w:rPr>
+          <w:rFonts w:ascii="Times New Roman" w:hAnsi="Times New Roman" w:cs="Times New Roman"/>
+        </w:rPr>
+        <w:t>ИД</w:t>
+      </w:r>
+      <w:r>
+        <w:rPr>
+          <w:rFonts w:ascii="Times New Roman" w:hAnsi="Times New Roman" w:cs="Times New Roman"/>
+          <w:lang w:val="en-US"/>
+        </w:rPr>
+        <w:t xml:space="preserve"> &lt; 1;</w:t>
+      </w:r>
+    </w:p>
+    <w:p>
+      <w:pPr>
+        <w:rPr>
+          <w:rFonts w:ascii="Times New Roman" w:hAnsi="Times New Roman" w:cs="Times New Roman"/>
+          <w:b/>
+          <w:bCs/>
+        </w:rPr>
+      </w:pPr>
+      <w:r>
+        <w:rPr>
+          <w:rFonts w:ascii="Times New Roman" w:hAnsi="Times New Roman" w:cs="Times New Roman"/>
+          <w:b/>
+          <w:bCs/>
+        </w:rPr>
+        <w:t>Индексы:</w:t>
+      </w:r>
+    </w:p>
+    <w:p>
+      <w:pPr>
+        <w:rPr>
+          <w:rFonts w:ascii="Times New Roman" w:hAnsi="Times New Roman" w:cs="Times New Roman"/>
+        </w:rPr>
+      </w:pPr>
+      <w:r>
+        <w:rPr>
+          <w:rFonts w:ascii="Times New Roman" w:hAnsi="Times New Roman" w:cs="Times New Roman"/>
+        </w:rPr>
+        <w:t xml:space="preserve">Для ускорения выполнения данного запроса я бы использовал </w:t>
+      </w:r>
+      <w:r>
+        <w:rPr>
+          <w:rFonts w:ascii="Times New Roman" w:hAnsi="Times New Roman" w:cs="Times New Roman"/>
+          <w:lang w:val="en-US"/>
+        </w:rPr>
+        <w:t>B</w:t>
+      </w:r>
+      <w:r>
+        <w:rPr>
+          <w:rFonts w:ascii="Times New Roman" w:hAnsi="Times New Roman" w:cs="Times New Roman"/>
+        </w:rPr>
+        <w:t>-</w:t>
+      </w:r>
+      <w:r>
+        <w:rPr>
+          <w:rFonts w:ascii="Times New Roman" w:hAnsi="Times New Roman" w:cs="Times New Roman"/>
+          <w:lang w:val="en-US"/>
+        </w:rPr>
+        <w:t>tree</w:t>
+      </w:r>
+      <w:r>
+        <w:rPr>
+          <w:rFonts w:ascii="Times New Roman" w:hAnsi="Times New Roman" w:cs="Times New Roman"/>
+        </w:rPr>
+        <w:t xml:space="preserve"> индексы для отношений Н_ЛЮДИ и Н_ОБУЧЕНИЯ и атрибутов ИМЯ и НЗК _ИД соответственно. B-</w:t>
+      </w:r>
+      <w:r>
+        <w:rPr>
+          <w:rFonts w:ascii="Times New Roman" w:hAnsi="Times New Roman" w:cs="Times New Roman"/>
+          <w:lang w:val="en-US"/>
+        </w:rPr>
+        <w:t>tree</w:t>
+      </w:r>
+      <w:r>
+        <w:rPr>
+          <w:rFonts w:ascii="Times New Roman" w:hAnsi="Times New Roman" w:cs="Times New Roman"/>
+        </w:rPr>
+        <w:t xml:space="preserve"> способен эффективно выбирать строки, основываясь на их положении в дереве. Также выбор </w:t>
+      </w:r>
+      <w:r>
+        <w:rPr>
+          <w:rFonts w:ascii="Times New Roman" w:hAnsi="Times New Roman" w:cs="Times New Roman"/>
+          <w:lang w:val="en-US"/>
+        </w:rPr>
+        <w:t>B</w:t>
+      </w:r>
+      <w:r>
+        <w:rPr>
+          <w:rFonts w:ascii="Times New Roman" w:hAnsi="Times New Roman" w:cs="Times New Roman"/>
+        </w:rPr>
+        <w:t>-</w:t>
+      </w:r>
+      <w:r>
+        <w:rPr>
+          <w:rFonts w:ascii="Times New Roman" w:hAnsi="Times New Roman" w:cs="Times New Roman"/>
+          <w:lang w:val="en-US"/>
+        </w:rPr>
+        <w:t>tree</w:t>
+      </w:r>
+      <w:r>
+        <w:rPr>
+          <w:rFonts w:ascii="Times New Roman" w:hAnsi="Times New Roman" w:cs="Times New Roman"/>
+        </w:rPr>
+        <w:t xml:space="preserve"> обусловлен тем, что в запросе используются операции сравнения.</w:t>
+      </w:r>
+      <w:r>
+        <w:rPr>
+          <w:rFonts w:ascii="Times New Roman" w:hAnsi="Times New Roman" w:cs="Times New Roman"/>
+        </w:rPr>
+        <w:t xml:space="preserve"> </w:t>
+      </w:r>
+      <w:r>
+        <w:rPr>
+          <w:rFonts w:ascii="Times New Roman" w:hAnsi="Times New Roman" w:cs="Times New Roman"/>
+        </w:rPr>
+        <w:br/>
+      </w:r>
+      <w:r>
+        <w:rPr>
+          <w:rFonts w:ascii="Times New Roman" w:hAnsi="Times New Roman" w:cs="Times New Roman"/>
+        </w:rPr>
+        <w:t>Атрибут Н_УЧЕНИКИ.ИД является первичным ключом, поэтому для него не имеет смысла создавать индекс, так как он будет автоматически.</w:t>
+      </w:r>
+      <w:r>
+        <w:rPr>
+          <w:rFonts w:ascii="Times New Roman" w:hAnsi="Times New Roman" w:cs="Times New Roman"/>
+        </w:rPr>
+        <w:t xml:space="preserve"> Для ускорения работы </w:t>
+      </w:r>
+      <w:r>
+        <w:rPr>
+          <w:rFonts w:ascii="Times New Roman" w:hAnsi="Times New Roman" w:cs="Times New Roman"/>
+          <w:lang w:val="en-US"/>
+        </w:rPr>
+        <w:t>JOIN</w:t>
+      </w:r>
+      <w:r>
+        <w:rPr>
+          <w:rFonts w:ascii="Times New Roman" w:hAnsi="Times New Roman" w:cs="Times New Roman"/>
+        </w:rPr>
+        <w:t xml:space="preserve"> </w:t>
+      </w:r>
+      <w:r>
+        <w:rPr>
+          <w:rFonts w:ascii="Times New Roman" w:hAnsi="Times New Roman" w:cs="Times New Roman"/>
+        </w:rPr>
+        <w:t>можно также добавить последние два индекса ниже</w:t>
+      </w:r>
+      <w:r>
+        <w:rPr>
+          <w:rFonts w:ascii="Times New Roman" w:hAnsi="Times New Roman" w:cs="Times New Roman"/>
+        </w:rPr>
+        <w:t>:</w:t>
+      </w:r>
+    </w:p>
+    <w:p>
+      <w:pPr>
+        <w:rPr>
+          <w:rFonts w:ascii="Times New Roman" w:hAnsi="Times New Roman" w:cs="Times New Roman"/>
+          <w:lang w:val="en-US"/>
+        </w:rPr>
+      </w:pPr>
+      <w:r>
+        <w:rPr>
+          <w:rFonts w:ascii="Times New Roman" w:hAnsi="Times New Roman" w:cs="Times New Roman"/>
+          <w:lang w:val="en-US"/>
+        </w:rPr>
+        <w:t>CREATE</w:t>
+      </w:r>
+      <w:r>
+        <w:rPr>
+          <w:rFonts w:ascii="Times New Roman" w:hAnsi="Times New Roman" w:cs="Times New Roman"/>
+          <w:lang w:val="en-US"/>
+        </w:rPr>
+        <w:t xml:space="preserve"> </w:t>
+      </w:r>
+      <w:r>
+        <w:rPr>
+          <w:rFonts w:ascii="Times New Roman" w:hAnsi="Times New Roman" w:cs="Times New Roman"/>
+          <w:lang w:val="en-US"/>
+        </w:rPr>
+        <w:t>INDEX</w:t>
+      </w:r>
+      <w:r>
+        <w:rPr>
+          <w:rFonts w:ascii="Times New Roman" w:hAnsi="Times New Roman" w:cs="Times New Roman"/>
+          <w:lang w:val="en-US"/>
+        </w:rPr>
+        <w:t xml:space="preserve"> </w:t>
+      </w:r>
+      <w:proofErr w:type="spellStart"/>
+      <w:r>
+        <w:rPr>
+          <w:rFonts w:ascii="Times New Roman" w:hAnsi="Times New Roman" w:cs="Times New Roman"/>
+          <w:lang w:val="en-US"/>
+        </w:rPr>
+        <w:t>idx</w:t>
+      </w:r>
+      <w:proofErr w:type="spellEnd"/>
+      <w:r>
+        <w:rPr>
+          <w:rFonts w:ascii="Times New Roman" w:hAnsi="Times New Roman" w:cs="Times New Roman"/>
+          <w:lang w:val="en-US"/>
+        </w:rPr>
+        <w:t>_</w:t>
+      </w:r>
+      <w:r>
+        <w:rPr>
+          <w:rFonts w:ascii="Times New Roman" w:hAnsi="Times New Roman" w:cs="Times New Roman"/>
+        </w:rPr>
+        <w:t>люди</w:t>
+      </w:r>
+      <w:r>
+        <w:rPr>
+          <w:rFonts w:ascii="Times New Roman" w:hAnsi="Times New Roman" w:cs="Times New Roman"/>
+          <w:lang w:val="en-US"/>
+        </w:rPr>
+        <w:t>_</w:t>
+      </w:r>
+      <w:r>
+        <w:rPr>
+          <w:rFonts w:ascii="Times New Roman" w:hAnsi="Times New Roman" w:cs="Times New Roman"/>
+        </w:rPr>
+        <w:t>имя</w:t>
+      </w:r>
+      <w:r>
+        <w:rPr>
+          <w:rFonts w:ascii="Times New Roman" w:hAnsi="Times New Roman" w:cs="Times New Roman"/>
+          <w:lang w:val="en-US"/>
+        </w:rPr>
+        <w:t xml:space="preserve"> </w:t>
+      </w:r>
+      <w:r>
+        <w:rPr>
+          <w:rFonts w:ascii="Times New Roman" w:hAnsi="Times New Roman" w:cs="Times New Roman"/>
+          <w:lang w:val="en-US"/>
+        </w:rPr>
+        <w:t>ON</w:t>
+      </w:r>
+      <w:r>
+        <w:rPr>
+          <w:rFonts w:ascii="Times New Roman" w:hAnsi="Times New Roman" w:cs="Times New Roman"/>
+          <w:lang w:val="en-US"/>
+        </w:rPr>
+        <w:t xml:space="preserve"> </w:t>
+      </w:r>
+      <w:r>
+        <w:rPr>
+          <w:rFonts w:ascii="Times New Roman" w:hAnsi="Times New Roman" w:cs="Times New Roman"/>
+        </w:rPr>
+        <w:t>Н</w:t>
+      </w:r>
+      <w:r>
+        <w:rPr>
+          <w:rFonts w:ascii="Times New Roman" w:hAnsi="Times New Roman" w:cs="Times New Roman"/>
+          <w:lang w:val="en-US"/>
+        </w:rPr>
+        <w:t>_</w:t>
+      </w:r>
+      <w:r>
+        <w:rPr>
+          <w:rFonts w:ascii="Times New Roman" w:hAnsi="Times New Roman" w:cs="Times New Roman"/>
+        </w:rPr>
+        <w:t>ЛЮДИ</w:t>
+      </w:r>
+      <w:r>
+        <w:rPr>
+          <w:rFonts w:ascii="Times New Roman" w:hAnsi="Times New Roman" w:cs="Times New Roman"/>
+          <w:lang w:val="en-US"/>
+        </w:rPr>
+        <w:t xml:space="preserve"> (</w:t>
+      </w:r>
+      <w:r>
+        <w:rPr>
+          <w:rFonts w:ascii="Times New Roman" w:hAnsi="Times New Roman" w:cs="Times New Roman"/>
+        </w:rPr>
+        <w:t>ИМЯ</w:t>
+      </w:r>
+      <w:r>
+        <w:rPr>
+          <w:rFonts w:ascii="Times New Roman" w:hAnsi="Times New Roman" w:cs="Times New Roman"/>
+          <w:lang w:val="en-US"/>
+        </w:rPr>
+        <w:t>);</w:t>
+      </w:r>
+    </w:p>
+    <w:p>
+      <w:pPr>
+        <w:rPr>
+          <w:rFonts w:ascii="Times New Roman" w:hAnsi="Times New Roman" w:cs="Times New Roman"/>
+        </w:rPr>
+      </w:pPr>
+      <w:r>
+        <w:rPr>
+          <w:rFonts w:ascii="Times New Roman" w:hAnsi="Times New Roman" w:cs="Times New Roman"/>
+        </w:rPr>
+        <w:t xml:space="preserve">CREATE INDEX </w:t>
+      </w:r>
+      <w:proofErr w:type="spellStart"/>
+      <w:r>
+        <w:rPr>
+          <w:rFonts w:ascii="Times New Roman" w:hAnsi="Times New Roman" w:cs="Times New Roman"/>
+        </w:rPr>
+        <w:t>idx_обучения_нзк</w:t>
+      </w:r>
+      <w:proofErr w:type="spellEnd"/>
+      <w:r>
+        <w:rPr>
+          <w:rFonts w:ascii="Times New Roman" w:hAnsi="Times New Roman" w:cs="Times New Roman"/>
+        </w:rPr>
+        <w:t xml:space="preserve"> ON Н_ОБУЧЕНИЯ (НЗК);</w:t>
+      </w:r>
+    </w:p>
+    <w:p>
+      <w:pPr>
+        <w:rPr>
+          <w:rFonts w:ascii="Times New Roman" w:hAnsi="Times New Roman" w:cs="Times New Roman"/>
+        </w:rPr>
+      </w:pPr>
+      <w:r>
+        <w:rPr>
+          <w:rFonts w:ascii="Times New Roman" w:hAnsi="Times New Roman" w:cs="Times New Roman"/>
+        </w:rPr>
+        <w:t xml:space="preserve">CREATE INDEX </w:t>
+      </w:r>
+      <w:proofErr w:type="spellStart"/>
+      <w:r>
+        <w:rPr>
+          <w:rFonts w:ascii="Times New Roman" w:hAnsi="Times New Roman" w:cs="Times New Roman"/>
+        </w:rPr>
+        <w:t>idx_обучения_члвк_ид</w:t>
+      </w:r>
+      <w:proofErr w:type="spellEnd"/>
+      <w:r>
+        <w:rPr>
+          <w:rFonts w:ascii="Times New Roman" w:hAnsi="Times New Roman" w:cs="Times New Roman"/>
+        </w:rPr>
+        <w:t xml:space="preserve"> ON Н_ОБУЧЕНИЯ (ЧЛВК_ИД);</w:t>
+      </w:r>
+    </w:p>
+    <w:p>
+      <w:pPr>
+        <w:rPr>
+          <w:rFonts w:ascii="Times New Roman" w:hAnsi="Times New Roman" w:cs="Times New Roman"/>
+        </w:rPr>
+      </w:pPr>
+      <w:r>
+        <w:rPr>
+          <w:rFonts w:ascii="Times New Roman" w:hAnsi="Times New Roman" w:cs="Times New Roman"/>
+        </w:rPr>
+        <w:t xml:space="preserve">CREATE INDEX </w:t>
+      </w:r>
+      <w:proofErr w:type="spellStart"/>
+      <w:r>
+        <w:rPr>
+          <w:rFonts w:ascii="Times New Roman" w:hAnsi="Times New Roman" w:cs="Times New Roman"/>
+        </w:rPr>
+        <w:t>idx_ученики_члвк_ид</w:t>
+      </w:r>
+      <w:proofErr w:type="spellEnd"/>
+      <w:r>
+        <w:rPr>
+          <w:rFonts w:ascii="Times New Roman" w:hAnsi="Times New Roman" w:cs="Times New Roman"/>
+        </w:rPr>
+        <w:t xml:space="preserve"> ON Н_УЧЕНИКИ (ЧЛВК_ИД);</w:t>
+      </w:r>
+    </w:p>
+    <w:p>
+      <w:pPr>
+        <w:rPr>
+          <w:rFonts w:ascii="Times New Roman" w:hAnsi="Times New Roman" w:cs="Times New Roman"/>
+        </w:rPr>
+      </w:pPr>
+      <w:r>
+        <w:rPr>
+          <w:rFonts w:ascii="Times New Roman" w:hAnsi="Times New Roman" w:cs="Times New Roman"/>
+        </w:rPr>
+        <w:t xml:space="preserve">При добавлении индексов планы выполнения запросов </w:t>
+      </w:r>
+      <w:r>
+        <w:rPr>
+          <w:rFonts w:ascii="Times New Roman" w:hAnsi="Times New Roman" w:cs="Times New Roman"/>
+        </w:rPr>
+        <w:t>по</w:t>
+      </w:r>
+      <w:r>
+        <w:rPr>
+          <w:rFonts w:ascii="Times New Roman" w:hAnsi="Times New Roman" w:cs="Times New Roman"/>
+        </w:rPr>
+        <w:t xml:space="preserve">меняются. Вместо полного сканирования таблиц </w:t>
+      </w:r>
+      <w:r>
+        <w:rPr>
+          <w:rFonts w:ascii="Times New Roman" w:hAnsi="Times New Roman" w:cs="Times New Roman"/>
+        </w:rPr>
+        <w:t xml:space="preserve">будут </w:t>
+      </w:r>
+      <w:r>
+        <w:rPr>
+          <w:rFonts w:ascii="Times New Roman" w:hAnsi="Times New Roman" w:cs="Times New Roman"/>
+        </w:rPr>
+        <w:t>использ</w:t>
+      </w:r>
+      <w:r>
+        <w:rPr>
+          <w:rFonts w:ascii="Times New Roman" w:hAnsi="Times New Roman" w:cs="Times New Roman"/>
+        </w:rPr>
+        <w:t>ова</w:t>
+      </w:r>
+      <w:r>
+        <w:rPr>
+          <w:rFonts w:ascii="Times New Roman" w:hAnsi="Times New Roman" w:cs="Times New Roman"/>
+        </w:rPr>
+        <w:t>т</w:t>
+      </w:r>
+      <w:r>
+        <w:rPr>
+          <w:rFonts w:ascii="Times New Roman" w:hAnsi="Times New Roman" w:cs="Times New Roman"/>
+        </w:rPr>
+        <w:t>ь</w:t>
+      </w:r>
+      <w:r>
+        <w:rPr>
+          <w:rFonts w:ascii="Times New Roman" w:hAnsi="Times New Roman" w:cs="Times New Roman"/>
+        </w:rPr>
+        <w:t>ся индексные просмотры, благодаря чему сокращается количество считываемых страниц</w:t>
+      </w:r>
+      <w:r>
+        <w:rPr>
+          <w:rFonts w:ascii="Times New Roman" w:hAnsi="Times New Roman" w:cs="Times New Roman"/>
+        </w:rPr>
+        <w:t xml:space="preserve">. </w:t>
+      </w:r>
+      <w:r>
+        <w:rPr>
+          <w:rFonts w:ascii="Times New Roman" w:hAnsi="Times New Roman" w:cs="Times New Roman"/>
+        </w:rPr>
+        <w:t>В итоге общая стоимость выполнения запроса значительно уменьшается</w:t>
+      </w:r>
+      <w:r>
+        <w:rPr>
+          <w:rFonts w:ascii="Times New Roman" w:hAnsi="Times New Roman" w:cs="Times New Roman"/>
+        </w:rPr>
+        <w:t>.</w:t>
+      </w:r>
+    </w:p>
+    <w:p>
+      <w:pPr>
+        <w:rPr>
+          <w:rFonts w:ascii="Times New Roman" w:hAnsi="Times New Roman" w:cs="Times New Roman"/>
+        </w:rPr>
+      </w:pPr>
+    </w:p>
+    <w:p>
+      <w:pPr>
+        <w:rPr>
+          <w:rFonts w:ascii="Times New Roman" w:hAnsi="Times New Roman" w:cs="Times New Roman"/>
+          <w:b/>
+          <w:bCs/>
+        </w:rPr>
+      </w:pPr>
+      <w:r>
+        <w:rPr>
+          <w:rFonts w:ascii="Times New Roman" w:hAnsi="Times New Roman" w:cs="Times New Roman"/>
+          <w:b/>
+          <w:bCs/>
+          <w:lang w:val="en-US"/>
+        </w:rPr>
+        <w:t>EXPLAIN</w:t>
+      </w:r>
+      <w:r>
+        <w:rPr>
+          <w:rFonts w:ascii="Times New Roman" w:hAnsi="Times New Roman" w:cs="Times New Roman"/>
+          <w:b/>
+          <w:bCs/>
+        </w:rPr>
+        <w:t xml:space="preserve"> </w:t>
+      </w:r>
+      <w:r>
+        <w:rPr>
+          <w:rFonts w:ascii="Times New Roman" w:hAnsi="Times New Roman" w:cs="Times New Roman"/>
+          <w:b/>
+          <w:bCs/>
+          <w:lang w:val="en-US"/>
+        </w:rPr>
+        <w:t>ANALYZE</w:t>
+      </w:r>
+      <w:r>
+        <w:rPr>
+          <w:rFonts w:ascii="Times New Roman" w:hAnsi="Times New Roman" w:cs="Times New Roman"/>
+          <w:b/>
+          <w:bCs/>
+        </w:rPr>
+        <w:t>:</w:t>
+      </w:r>
+    </w:p>
+    <w:p>
+      <w:pPr>
+        <w:rPr>
+          <w:rFonts w:ascii="Times New Roman" w:hAnsi="Times New Roman" w:cs="Times New Roman"/>
+          <w:b/>
+          <w:bCs/>
+        </w:rPr>
+      </w:pPr>
+      <w:r>
+        <w:rPr>
+          <w:rFonts w:ascii="Times New Roman" w:hAnsi="Times New Roman" w:cs="Times New Roman"/>
+          <w:b/>
+          <w:bCs/>
+          <w:noProof/>
+        </w:rPr>
+        <w:lastRenderedPageBreak/>
+        <w:drawing>
+          <wp:inline distT="0" distB="0" distL="0" distR="0" wp14:anchorId="3B2A796C" wp14:editId="3E945B65">
+            <wp:extent cx="5939790" cy="1634374"/>
+            <wp:effectExtent l="0" t="0" r="3810" b="4445"/>
+            <wp:docPr id="501406090" name="Рисунок 1"/>
+            <wp:cNvGraphicFramePr>
+              <a:graphicFrameLocks xmlns:a="http://schemas.openxmlformats.org/drawingml/2006/main" noChangeAspect="1"/>
+            </wp:cNvGraphicFramePr>
+            <a:graphic xmlns:a="http://schemas.openxmlformats.org/drawingml/2006/main">
+              <a:graphicData uri="http://schemas.openxmlformats.org/drawingml/2006/picture">
+                <pic:pic xmlns:pic="http://schemas.openxmlformats.org/drawingml/2006/picture">
+                  <pic:nvPicPr>
+                    <pic:cNvPr id="501406090" name=""/>
+                    <pic:cNvPicPr/>
+                  </pic:nvPicPr>
+                  <pic:blipFill rotWithShape="1">
+                    <a:blip r:embed="rId11"/>
+                    <a:srcRect t="1007"/>
+                    <a:stretch>
+                      <a:fillRect/>
+                    </a:stretch>
+                  </pic:blipFill>
+                  <pic:spPr bwMode="auto">
+                    <a:xfrm>
+                      <a:off x="0" y="0"/>
+                      <a:ext cx="5939790" cy="1634374"/>
+                    </a:xfrm>
+                    <a:prstGeom prst="rect">
+                      <a:avLst/>
+                    </a:prstGeom>
+                    <a:ln>
+                      <a:noFill/>
+                    </a:ln>
+                    <a:extLst>
+                      <a:ext uri="{53640926-AAD7-44D8-BBD7-CCE9431645EC}">
+                        <a14:shadowObscured xmlns:a14="http://schemas.microsoft.com/office/drawing/2010/main"/>
+                      </a:ext>
+                    </a:extLst>
+                  </pic:spPr>
+                </pic:pic>
+              </a:graphicData>
+            </a:graphic>
+          </wp:inline>
+        </w:drawing>
+      </w:r>
+    </w:p>
+    <w:p>
+      <w:pPr>
+        <w:rPr>
+          <w:rFonts w:ascii="Times New Roman" w:hAnsi="Times New Roman" w:cs="Times New Roman"/>
+          <w:b/>
+          <w:bCs/>
+          <w:lang w:val="en-US"/>
+        </w:rPr>
+      </w:pPr>
+    </w:p>
+    <w:p>
+      <w:pPr>
+        <w:rPr>
+          <w:rFonts w:ascii="Times New Roman" w:hAnsi="Times New Roman" w:cs="Times New Roman"/>
+          <w:b/>
+          <w:bCs/>
+        </w:rPr>
+      </w:pPr>
+      <w:r>
+        <w:rPr>
+          <w:rFonts w:ascii="Times New Roman" w:hAnsi="Times New Roman" w:cs="Times New Roman"/>
+          <w:b/>
+          <w:bCs/>
+        </w:rPr>
+        <w:t>Планы выполнения запроса</w:t>
+      </w:r>
+    </w:p>
+    <w:p>
+      <w:pPr>
+        <w:rPr>
+          <w:rFonts w:ascii="Times New Roman" w:hAnsi="Times New Roman" w:cs="Times New Roman"/>
+        </w:rPr>
+      </w:pPr>
+      <w:r>
+        <w:rPr>
+          <w:rFonts w:ascii="Times New Roman" w:hAnsi="Times New Roman" w:cs="Times New Roman"/>
+        </w:rPr>
+        <w:t>1)</w:t>
+      </w:r>
+    </w:p>
+    <w:p>
+      <w:pPr>
+        <w:rPr>
+          <w:rFonts w:ascii="Times New Roman" w:hAnsi="Times New Roman" w:cs="Times New Roman"/>
+        </w:rPr>
+      </w:pPr>
+      <w:r>
+        <w:rPr>
+          <w:noProof/>
+        </w:rPr>
+        <w:t xml:space="preserve"> </w:t>
+      </w:r>
+      <w:r>
+        <w:rPr>
+          <w:rFonts w:ascii="Times New Roman" w:hAnsi="Times New Roman" w:cs="Times New Roman"/>
+          <w:noProof/>
+          <w:lang w:val="en-US"/>
+        </w:rPr>
+        <w:drawing>
+          <wp:inline distT="0" distB="0" distL="0" distR="0" wp14:anchorId="37EEE773" wp14:editId="6FABF993">
+            <wp:extent cx="5611091" cy="5539707"/>
+            <wp:effectExtent l="0" t="0" r="8890" b="4445"/>
+            <wp:docPr id="963064214" name="Рисунок 1"/>
+            <wp:cNvGraphicFramePr>
+              <a:graphicFrameLocks xmlns:a="http://schemas.openxmlformats.org/drawingml/2006/main" noChangeAspect="1"/>
+            </wp:cNvGraphicFramePr>
+            <a:graphic xmlns:a="http://schemas.openxmlformats.org/drawingml/2006/main">
+              <a:graphicData uri="http://schemas.openxmlformats.org/drawingml/2006/picture">
+                <pic:pic xmlns:pic="http://schemas.openxmlformats.org/drawingml/2006/picture">
+                  <pic:nvPicPr>
+                    <pic:cNvPr id="963064214" name=""/>
+                    <pic:cNvPicPr/>
+                  </pic:nvPicPr>
+                  <pic:blipFill>
+                    <a:blip r:embed="rId12"/>
+                    <a:stretch>
+                      <a:fillRect/>
+                    </a:stretch>
+                  </pic:blipFill>
+                  <pic:spPr>
+                    <a:xfrm>
+                      <a:off x="0" y="0"/>
+                      <a:ext cx="5616298" cy="5544848"/>
+                    </a:xfrm>
+                    <a:prstGeom prst="rect">
+                      <a:avLst/>
+                    </a:prstGeom>
+                  </pic:spPr>
+                </pic:pic>
+              </a:graphicData>
+            </a:graphic>
+          </wp:inline>
+        </w:drawing>
+      </w:r>
+    </w:p>
+    <w:p>
+      <w:pPr>
+        <w:rPr>
+          <w:rFonts w:ascii="Times New Roman" w:hAnsi="Times New Roman" w:cs="Times New Roman"/>
+        </w:rPr>
+      </w:pPr>
+      <w:r>
+        <w:rPr>
+          <w:rFonts w:ascii="Times New Roman" w:hAnsi="Times New Roman" w:cs="Times New Roman"/>
+          <w:noProof/>
+          <w:lang w:val="en-US"/>
+        </w:rPr>
+        <w:lastRenderedPageBreak/>
+        <w:drawing>
+          <wp:anchor distT="0" distB="0" distL="114300" distR="114300" simplePos="0" relativeHeight="251658240" behindDoc="1" locked="0" layoutInCell="1" allowOverlap="1" wp14:anchorId="4C3C5F5F" wp14:editId="4804E493">
+            <wp:simplePos x="0" y="0"/>
+            <wp:positionH relativeFrom="column">
+              <wp:posOffset>499110</wp:posOffset>
+            </wp:positionH>
+            <wp:positionV relativeFrom="paragraph">
+              <wp:posOffset>2540</wp:posOffset>
+            </wp:positionV>
+            <wp:extent cx="5053965" cy="4714240"/>
+            <wp:effectExtent l="0" t="0" r="0" b="0"/>
+            <wp:wrapTight wrapText="bothSides">
+              <wp:wrapPolygon edited="0">
+                <wp:start x="0" y="0"/>
+                <wp:lineTo x="0" y="21472"/>
+                <wp:lineTo x="21494" y="21472"/>
+                <wp:lineTo x="21494" y="0"/>
+                <wp:lineTo x="0" y="0"/>
+              </wp:wrapPolygon>
+            </wp:wrapTight>
+            <wp:docPr id="1996454255" name="Рисунок 1"/>
+            <wp:cNvGraphicFramePr>
+              <a:graphicFrameLocks xmlns:a="http://schemas.openxmlformats.org/drawingml/2006/main" noChangeAspect="1"/>
+            </wp:cNvGraphicFramePr>
+            <a:graphic xmlns:a="http://schemas.openxmlformats.org/drawingml/2006/main">
+              <a:graphicData uri="http://schemas.openxmlformats.org/drawingml/2006/picture">
+                <pic:pic xmlns:pic="http://schemas.openxmlformats.org/drawingml/2006/picture">
+                  <pic:nvPicPr>
+                    <pic:cNvPr id="1996454255" name=""/>
+                    <pic:cNvPicPr/>
+                  </pic:nvPicPr>
+                  <pic:blipFill>
+                    <a:blip r:embed="rId13">
+                      <a:extLst>
+                        <a:ext uri="{28A0092B-C50C-407E-A947-70E740481C1C}">
+                          <a14:useLocalDpi xmlns:a14="http://schemas.microsoft.com/office/drawing/2010/main" val="0"/>
+                        </a:ext>
+                      </a:extLst>
+                    </a:blip>
+                    <a:stretch>
+                      <a:fillRect/>
+                    </a:stretch>
+                  </pic:blipFill>
+                  <pic:spPr>
+                    <a:xfrm>
+                      <a:off x="0" y="0"/>
+                      <a:ext cx="5053965" cy="4714240"/>
+                    </a:xfrm>
+                    <a:prstGeom prst="rect">
+                      <a:avLst/>
+                    </a:prstGeom>
+                  </pic:spPr>
+                </pic:pic>
+              </a:graphicData>
+            </a:graphic>
+            <wp14:sizeRelH relativeFrom="margin">
+              <wp14:pctWidth>0</wp14:pctWidth>
+            </wp14:sizeRelH>
+            <wp14:sizeRelV relativeFrom="margin">
+              <wp14:pctHeight>0</wp14:pctHeight>
+            </wp14:sizeRelV>
+          </wp:anchor>
+        </w:drawing>
+      </w:r>
+      <w:r>
+        <w:rPr>
+          <w:rFonts w:ascii="Times New Roman" w:hAnsi="Times New Roman" w:cs="Times New Roman"/>
+        </w:rPr>
+        <w:t>2)</w:t>
+      </w:r>
+    </w:p>
+    <w:p>
+      <w:pPr>
+        <w:rPr>
+          <w:rFonts w:ascii="Times New Roman" w:hAnsi="Times New Roman" w:cs="Times New Roman"/>
+        </w:rPr>
+      </w:pPr>
+      <w:r>
+        <w:rPr>
+          <w:noProof/>
+        </w:rPr>
+        <w:t xml:space="preserve"> </w:t>
+      </w:r>
+    </w:p>
+    <w:p>
+      <w:pPr>
+        <w:rPr>
+          <w:rFonts w:ascii="Times New Roman" w:hAnsi="Times New Roman" w:cs="Times New Roman"/>
+        </w:rPr>
+      </w:pPr>
+    </w:p>
+    <w:p>
+      <w:pPr>
+        <w:rPr>
+          <w:rFonts w:ascii="Times New Roman" w:hAnsi="Times New Roman" w:cs="Times New Roman"/>
+        </w:rPr>
+      </w:pPr>
+    </w:p>
+    <w:p>
+      <w:pPr>
+        <w:rPr>
+          <w:rFonts w:ascii="Times New Roman" w:hAnsi="Times New Roman" w:cs="Times New Roman"/>
+        </w:rPr>
+      </w:pPr>
+    </w:p>
+    <w:p>
+      <w:pPr>
+        <w:rPr>
+          <w:rFonts w:ascii="Times New Roman" w:hAnsi="Times New Roman" w:cs="Times New Roman"/>
+        </w:rPr>
+      </w:pPr>
+    </w:p>
+    <w:p>
+      <w:pPr>
+        <w:rPr>
+          <w:rFonts w:ascii="Times New Roman" w:hAnsi="Times New Roman" w:cs="Times New Roman"/>
+        </w:rPr>
+      </w:pPr>
+    </w:p>
+    <w:p>
+      <w:pPr>
+        <w:rPr>
+          <w:rFonts w:ascii="Times New Roman" w:hAnsi="Times New Roman" w:cs="Times New Roman"/>
+        </w:rPr>
+      </w:pPr>
+    </w:p>
+    <w:p>
+      <w:pPr>
+        <w:rPr>
+          <w:rFonts w:ascii="Times New Roman" w:hAnsi="Times New Roman" w:cs="Times New Roman"/>
+        </w:rPr>
+      </w:pPr>
+    </w:p>
+    <w:p>
+      <w:pPr>
+        <w:rPr>
+          <w:rFonts w:ascii="Times New Roman" w:hAnsi="Times New Roman" w:cs="Times New Roman"/>
+        </w:rPr>
+      </w:pPr>
+    </w:p>
+    <w:p>
+      <w:pPr>
+        <w:rPr>
+          <w:rFonts w:ascii="Times New Roman" w:hAnsi="Times New Roman" w:cs="Times New Roman"/>
+        </w:rPr>
+      </w:pPr>
+    </w:p>
+    <w:p>
+      <w:pPr>
+        <w:rPr>
+          <w:rFonts w:ascii="Times New Roman" w:hAnsi="Times New Roman" w:cs="Times New Roman"/>
+        </w:rPr>
+      </w:pPr>
+    </w:p>
+    <w:p>
+      <w:pPr>
+        <w:rPr>
+          <w:rFonts w:ascii="Times New Roman" w:hAnsi="Times New Roman" w:cs="Times New Roman"/>
+        </w:rPr>
+      </w:pPr>
+    </w:p>
+    <w:p>
+      <w:pPr>
+        <w:rPr>
+          <w:rFonts w:ascii="Times New Roman" w:hAnsi="Times New Roman" w:cs="Times New Roman"/>
+        </w:rPr>
+      </w:pPr>
+    </w:p>
+    <w:p>
+      <w:pPr>
+        <w:rPr>
+          <w:rFonts w:ascii="Times New Roman" w:hAnsi="Times New Roman" w:cs="Times New Roman"/>
+        </w:rPr>
+      </w:pPr>
+    </w:p>
+    <w:p>
+      <w:pPr>
+        <w:rPr>
+          <w:rFonts w:ascii="Times New Roman" w:hAnsi="Times New Roman" w:cs="Times New Roman"/>
+        </w:rPr>
+      </w:pPr>
+    </w:p>
+    <w:p>
+      <w:pPr>
+        <w:rPr>
+          <w:rFonts w:ascii="Times New Roman" w:hAnsi="Times New Roman" w:cs="Times New Roman"/>
+        </w:rPr>
+      </w:pPr>
+    </w:p>
+    <w:p>
+      <w:pPr>
+        <w:pStyle w:val="a3"/>
+        <w:rPr>
+          <w:b/>
+          <w:bCs/>
+        </w:rPr>
+      </w:pPr>
+      <w:bookmarkStart w:id="3" w:name="_Toc231281405"/>
+      <w:r>
+        <w:rPr>
+          <w:b/>
+          <w:bCs/>
+        </w:rPr>
+        <w:t>Вывод</w:t>
+      </w:r>
+      <w:bookmarkEnd w:id="3"/>
+    </w:p>
+    <w:p>
+      <w:r>
+        <w:t xml:space="preserve">В ходе выполнения лабораторной я узнал зачем используются индексы, как именно выполняются запросы, и как их оптимизировать. </w:t>
+      </w:r>
+      <w:r>
+        <w:t>Кроме того,</w:t>
+      </w:r>
+      <w:r>
+        <w:t xml:space="preserve"> я познакомился с реляционной алгеброй и научился рисовать диаграммы выполнения запросов.</w:t>
+      </w:r>
     </w:p>
     <w:sectPr>
-      <w:footerReference w:type="default" r:id="rId8"/>
+      <w:footerReference w:type="default" r:id="rId14"/>
       <w:pgSz w:w="11906" w:h="16838"/>
       <w:pgMar w:top="1134" w:right="851" w:bottom="1134" w:left="1701" w:header="709" w:footer="709" w:gutter="0"/>
       <w:pgNumType w:start="1"/>
@@ -1595,6 +4885,95 @@
     </w:lvl>
   </w:abstractNum>
   <w:abstractNum w:abstractNumId="2" w15:restartNumberingAfterBreak="0">
+    <w:nsid w:val="0F752C03"/>
+    <w:multiLevelType w:val="hybridMultilevel"/>
+    <w:tmpl w:val="5DA05E3C"/>
+    <w:lvl w:ilvl="0" w:tplc="FFFFFFFF">
+      <w:start w:val="1"/>
+      <w:numFmt w:val="decimal"/>
+      <w:lvlText w:val="%1)"/>
+      <w:lvlJc w:val="left"/>
+      <w:pPr>
+        <w:ind w:left="720" w:hanging="360"/>
+      </w:pPr>
+      <w:rPr>
+        <w:rFonts w:hint="default"/>
+      </w:rPr>
+    </w:lvl>
+    <w:lvl w:ilvl="1" w:tplc="FFFFFFFF" w:tentative="1">
+      <w:start w:val="1"/>
+      <w:numFmt w:val="lowerLetter"/>
+      <w:lvlText w:val="%2."/>
+      <w:lvlJc w:val="left"/>
+      <w:pPr>
+        <w:ind w:left="1440" w:hanging="360"/>
+      </w:pPr>
+    </w:lvl>
+    <w:lvl w:ilvl="2" w:tplc="FFFFFFFF" w:tentative="1">
+      <w:start w:val="1"/>
+      <w:numFmt w:val="lowerRoman"/>
+      <w:lvlText w:val="%3."/>
+      <w:lvlJc w:val="right"/>
+      <w:pPr>
+        <w:ind w:left="2160" w:hanging="180"/>
+      </w:pPr>
+    </w:lvl>
+    <w:lvl w:ilvl="3" w:tplc="FFFFFFFF" w:tentative="1">
+      <w:start w:val="1"/>
+      <w:numFmt w:val="decimal"/>
+      <w:lvlText w:val="%4."/>
+      <w:lvlJc w:val="left"/>
+      <w:pPr>
+        <w:ind w:left="2880" w:hanging="360"/>
+      </w:pPr>
+    </w:lvl>
+    <w:lvl w:ilvl="4" w:tplc="FFFFFFFF" w:tentative="1">
+      <w:start w:val="1"/>
+      <w:numFmt w:val="lowerLetter"/>
+      <w:lvlText w:val="%5."/>
+      <w:lvlJc w:val="left"/>
+      <w:pPr>
+        <w:ind w:left="3600" w:hanging="360"/>
+      </w:pPr>
+    </w:lvl>
+    <w:lvl w:ilvl="5" w:tplc="FFFFFFFF" w:tentative="1">
+      <w:start w:val="1"/>
+      <w:numFmt w:val="lowerRoman"/>
+      <w:lvlText w:val="%6."/>
+      <w:lvlJc w:val="right"/>
+      <w:pPr>
+        <w:ind w:left="4320" w:hanging="180"/>
+      </w:pPr>
+    </w:lvl>
+    <w:lvl w:ilvl="6" w:tplc="FFFFFFFF" w:tentative="1">
+      <w:start w:val="1"/>
+      <w:numFmt w:val="decimal"/>
+      <w:lvlText w:val="%7."/>
+      <w:lvlJc w:val="left"/>
+      <w:pPr>
+        <w:ind w:left="5040" w:hanging="360"/>
+      </w:pPr>
+    </w:lvl>
+    <w:lvl w:ilvl="7" w:tplc="FFFFFFFF" w:tentative="1">
+      <w:start w:val="1"/>
+      <w:numFmt w:val="lowerLetter"/>
+      <w:lvlText w:val="%8."/>
+      <w:lvlJc w:val="left"/>
+      <w:pPr>
+        <w:ind w:left="5760" w:hanging="360"/>
+      </w:pPr>
+    </w:lvl>
+    <w:lvl w:ilvl="8" w:tplc="FFFFFFFF" w:tentative="1">
+      <w:start w:val="1"/>
+      <w:numFmt w:val="lowerRoman"/>
+      <w:lvlText w:val="%9."/>
+      <w:lvlJc w:val="right"/>
+      <w:pPr>
+        <w:ind w:left="6480" w:hanging="180"/>
+      </w:pPr>
+    </w:lvl>
+  </w:abstractNum>
+  <w:abstractNum w:abstractNumId="3" w15:restartNumberingAfterBreak="0">
     <w:nsid w:val="18134A13"/>
     <w:multiLevelType w:val="hybridMultilevel"/>
     <w:tmpl w:val="4CC6A9B0"/>
@@ -1683,7 +5062,7 @@
       </w:pPr>
     </w:lvl>
   </w:abstractNum>
-  <w:abstractNum w:abstractNumId="3" w15:restartNumberingAfterBreak="0">
+  <w:abstractNum w:abstractNumId="4" w15:restartNumberingAfterBreak="0">
     <w:nsid w:val="24BE4252"/>
     <w:multiLevelType w:val="multilevel"/>
     <w:tmpl w:val="30628B04"/>
@@ -1796,7 +5175,7 @@
       </w:pPr>
     </w:lvl>
   </w:abstractNum>
-  <w:abstractNum w:abstractNumId="4" w15:restartNumberingAfterBreak="0">
+  <w:abstractNum w:abstractNumId="5" w15:restartNumberingAfterBreak="0">
     <w:nsid w:val="2F614968"/>
     <w:multiLevelType w:val="hybridMultilevel"/>
     <w:tmpl w:val="23B2CA14"/>
@@ -1885,7 +5264,7 @@
       </w:pPr>
     </w:lvl>
   </w:abstractNum>
-  <w:abstractNum w:abstractNumId="5" w15:restartNumberingAfterBreak="0">
+  <w:abstractNum w:abstractNumId="6" w15:restartNumberingAfterBreak="0">
     <w:nsid w:val="316A7D62"/>
     <w:multiLevelType w:val="hybridMultilevel"/>
     <w:tmpl w:val="4CC6A9B0"/>
@@ -1974,7 +5353,7 @@
       </w:pPr>
     </w:lvl>
   </w:abstractNum>
-  <w:abstractNum w:abstractNumId="6" w15:restartNumberingAfterBreak="0">
+  <w:abstractNum w:abstractNumId="7" w15:restartNumberingAfterBreak="0">
     <w:nsid w:val="32CE33F5"/>
     <w:multiLevelType w:val="multilevel"/>
     <w:tmpl w:val="1C0E96CA"/>
@@ -2087,7 +5466,7 @@
       </w:pPr>
     </w:lvl>
   </w:abstractNum>
-  <w:abstractNum w:abstractNumId="7" w15:restartNumberingAfterBreak="0">
+  <w:abstractNum w:abstractNumId="8" w15:restartNumberingAfterBreak="0">
     <w:nsid w:val="33976072"/>
     <w:multiLevelType w:val="hybridMultilevel"/>
     <w:tmpl w:val="98FEEC7C"/>
@@ -2173,7 +5552,7 @@
       </w:pPr>
     </w:lvl>
   </w:abstractNum>
-  <w:abstractNum w:abstractNumId="8" w15:restartNumberingAfterBreak="0">
+  <w:abstractNum w:abstractNumId="9" w15:restartNumberingAfterBreak="0">
     <w:nsid w:val="3603470E"/>
     <w:multiLevelType w:val="hybridMultilevel"/>
     <w:tmpl w:val="1CECEE48"/>
@@ -2262,7 +5641,7 @@
       </w:pPr>
     </w:lvl>
   </w:abstractNum>
-  <w:abstractNum w:abstractNumId="9" w15:restartNumberingAfterBreak="0">
+  <w:abstractNum w:abstractNumId="10" w15:restartNumberingAfterBreak="0">
     <w:nsid w:val="3F985975"/>
     <w:multiLevelType w:val="multilevel"/>
     <w:tmpl w:val="69B840DC"/>
@@ -2411,7 +5790,7 @@
       </w:rPr>
     </w:lvl>
   </w:abstractNum>
-  <w:abstractNum w:abstractNumId="10" w15:restartNumberingAfterBreak="0">
+  <w:abstractNum w:abstractNumId="11" w15:restartNumberingAfterBreak="0">
     <w:nsid w:val="40FA7E69"/>
     <w:multiLevelType w:val="hybridMultilevel"/>
     <w:tmpl w:val="C366DB08"/>
@@ -2524,7 +5903,7 @@
       </w:rPr>
     </w:lvl>
   </w:abstractNum>
-  <w:abstractNum w:abstractNumId="11" w15:restartNumberingAfterBreak="0">
+  <w:abstractNum w:abstractNumId="12" w15:restartNumberingAfterBreak="0">
     <w:nsid w:val="41406388"/>
     <w:multiLevelType w:val="hybridMultilevel"/>
     <w:tmpl w:val="A24270E0"/>
@@ -2613,7 +5992,7 @@
       </w:pPr>
     </w:lvl>
   </w:abstractNum>
-  <w:abstractNum w:abstractNumId="12" w15:restartNumberingAfterBreak="0">
+  <w:abstractNum w:abstractNumId="13" w15:restartNumberingAfterBreak="0">
     <w:nsid w:val="4E22301E"/>
     <w:multiLevelType w:val="hybridMultilevel"/>
     <w:tmpl w:val="B0A673CC"/>
@@ -2726,7 +6105,7 @@
       </w:rPr>
     </w:lvl>
   </w:abstractNum>
-  <w:abstractNum w:abstractNumId="13" w15:restartNumberingAfterBreak="0">
+  <w:abstractNum w:abstractNumId="14" w15:restartNumberingAfterBreak="0">
     <w:nsid w:val="53411954"/>
     <w:multiLevelType w:val="hybridMultilevel"/>
     <w:tmpl w:val="B0368D14"/>
@@ -2812,7 +6191,7 @@
       </w:pPr>
     </w:lvl>
   </w:abstractNum>
-  <w:abstractNum w:abstractNumId="14" w15:restartNumberingAfterBreak="0">
+  <w:abstractNum w:abstractNumId="15" w15:restartNumberingAfterBreak="0">
     <w:nsid w:val="55A43439"/>
     <w:multiLevelType w:val="hybridMultilevel"/>
     <w:tmpl w:val="91B427B2"/>
@@ -2901,7 +6280,7 @@
       </w:pPr>
     </w:lvl>
   </w:abstractNum>
-  <w:abstractNum w:abstractNumId="15" w15:restartNumberingAfterBreak="0">
+  <w:abstractNum w:abstractNumId="16" w15:restartNumberingAfterBreak="0">
     <w:nsid w:val="5E886293"/>
     <w:multiLevelType w:val="multilevel"/>
     <w:tmpl w:val="EB70D4A2"/>
@@ -3014,7 +6393,7 @@
       </w:pPr>
     </w:lvl>
   </w:abstractNum>
-  <w:abstractNum w:abstractNumId="16" w15:restartNumberingAfterBreak="0">
+  <w:abstractNum w:abstractNumId="17" w15:restartNumberingAfterBreak="0">
     <w:nsid w:val="64084B4F"/>
     <w:multiLevelType w:val="hybridMultilevel"/>
     <w:tmpl w:val="4CC6A9B0"/>
@@ -3103,7 +6482,7 @@
       </w:pPr>
     </w:lvl>
   </w:abstractNum>
-  <w:abstractNum w:abstractNumId="17" w15:restartNumberingAfterBreak="0">
+  <w:abstractNum w:abstractNumId="18" w15:restartNumberingAfterBreak="0">
     <w:nsid w:val="68682292"/>
     <w:multiLevelType w:val="hybridMultilevel"/>
     <w:tmpl w:val="8A96043A"/>
@@ -3192,7 +6571,96 @@
       </w:pPr>
     </w:lvl>
   </w:abstractNum>
-  <w:abstractNum w:abstractNumId="18" w15:restartNumberingAfterBreak="0">
+  <w:abstractNum w:abstractNumId="19" w15:restartNumberingAfterBreak="0">
+    <w:nsid w:val="77717547"/>
+    <w:multiLevelType w:val="hybridMultilevel"/>
+    <w:tmpl w:val="5DA05E3C"/>
+    <w:lvl w:ilvl="0" w:tplc="FFFFFFFF">
+      <w:start w:val="1"/>
+      <w:numFmt w:val="decimal"/>
+      <w:lvlText w:val="%1)"/>
+      <w:lvlJc w:val="left"/>
+      <w:pPr>
+        <w:ind w:left="720" w:hanging="360"/>
+      </w:pPr>
+      <w:rPr>
+        <w:rFonts w:hint="default"/>
+      </w:rPr>
+    </w:lvl>
+    <w:lvl w:ilvl="1" w:tplc="FFFFFFFF" w:tentative="1">
+      <w:start w:val="1"/>
+      <w:numFmt w:val="lowerLetter"/>
+      <w:lvlText w:val="%2."/>
+      <w:lvlJc w:val="left"/>
+      <w:pPr>
+        <w:ind w:left="1440" w:hanging="360"/>
+      </w:pPr>
+    </w:lvl>
+    <w:lvl w:ilvl="2" w:tplc="FFFFFFFF" w:tentative="1">
+      <w:start w:val="1"/>
+      <w:numFmt w:val="lowerRoman"/>
+      <w:lvlText w:val="%3."/>
+      <w:lvlJc w:val="right"/>
+      <w:pPr>
+        <w:ind w:left="2160" w:hanging="180"/>
+      </w:pPr>
+    </w:lvl>
+    <w:lvl w:ilvl="3" w:tplc="FFFFFFFF" w:tentative="1">
+      <w:start w:val="1"/>
+      <w:numFmt w:val="decimal"/>
+      <w:lvlText w:val="%4."/>
+      <w:lvlJc w:val="left"/>
+      <w:pPr>
+        <w:ind w:left="2880" w:hanging="360"/>
+      </w:pPr>
+    </w:lvl>
+    <w:lvl w:ilvl="4" w:tplc="FFFFFFFF" w:tentative="1">
+      <w:start w:val="1"/>
+      <w:numFmt w:val="lowerLetter"/>
+      <w:lvlText w:val="%5."/>
+      <w:lvlJc w:val="left"/>
+      <w:pPr>
+        <w:ind w:left="3600" w:hanging="360"/>
+      </w:pPr>
+    </w:lvl>
+    <w:lvl w:ilvl="5" w:tplc="FFFFFFFF" w:tentative="1">
+      <w:start w:val="1"/>
+      <w:numFmt w:val="lowerRoman"/>
+      <w:lvlText w:val="%6."/>
+      <w:lvlJc w:val="right"/>
+      <w:pPr>
+        <w:ind w:left="4320" w:hanging="180"/>
+      </w:pPr>
+    </w:lvl>
+    <w:lvl w:ilvl="6" w:tplc="FFFFFFFF" w:tentative="1">
+      <w:start w:val="1"/>
+      <w:numFmt w:val="decimal"/>
+      <w:lvlText w:val="%7."/>
+      <w:lvlJc w:val="left"/>
+      <w:pPr>
+        <w:ind w:left="5040" w:hanging="360"/>
+      </w:pPr>
+    </w:lvl>
+    <w:lvl w:ilvl="7" w:tplc="FFFFFFFF" w:tentative="1">
+      <w:start w:val="1"/>
+      <w:numFmt w:val="lowerLetter"/>
+      <w:lvlText w:val="%8."/>
+      <w:lvlJc w:val="left"/>
+      <w:pPr>
+        <w:ind w:left="5760" w:hanging="360"/>
+      </w:pPr>
+    </w:lvl>
+    <w:lvl w:ilvl="8" w:tplc="FFFFFFFF" w:tentative="1">
+      <w:start w:val="1"/>
+      <w:numFmt w:val="lowerRoman"/>
+      <w:lvlText w:val="%9."/>
+      <w:lvlJc w:val="right"/>
+      <w:pPr>
+        <w:ind w:left="6480" w:hanging="180"/>
+      </w:pPr>
+    </w:lvl>
+  </w:abstractNum>
+  <w:abstractNum w:abstractNumId="20" w15:restartNumberingAfterBreak="0">
     <w:nsid w:val="779434D7"/>
     <w:multiLevelType w:val="hybridMultilevel"/>
     <w:tmpl w:val="24B458F2"/>
@@ -3283,7 +6751,7 @@
       </w:pPr>
     </w:lvl>
   </w:abstractNum>
-  <w:abstractNum w:abstractNumId="19" w15:restartNumberingAfterBreak="0">
+  <w:abstractNum w:abstractNumId="21" w15:restartNumberingAfterBreak="0">
     <w:nsid w:val="7C981825"/>
     <w:multiLevelType w:val="hybridMultilevel"/>
     <w:tmpl w:val="98FEEC7C"/>
@@ -3370,64 +6838,70 @@
     </w:lvl>
   </w:abstractNum>
   <w:num w:numId="1" w16cid:durableId="679703036">
+    <w:abstractNumId w:val="8"/>
+  </w:num>
+  <w:num w:numId="2" w16cid:durableId="1816217102">
+    <w:abstractNumId w:val="18"/>
+  </w:num>
+  <w:num w:numId="3" w16cid:durableId="1936938849">
+    <w:abstractNumId w:val="21"/>
+  </w:num>
+  <w:num w:numId="4" w16cid:durableId="2025206295">
+    <w:abstractNumId w:val="12"/>
+  </w:num>
+  <w:num w:numId="5" w16cid:durableId="1151948683">
+    <w:abstractNumId w:val="15"/>
+  </w:num>
+  <w:num w:numId="6" w16cid:durableId="716320374">
+    <w:abstractNumId w:val="3"/>
+  </w:num>
+  <w:num w:numId="7" w16cid:durableId="1443114483">
+    <w:abstractNumId w:val="17"/>
+  </w:num>
+  <w:num w:numId="8" w16cid:durableId="2098790857">
+    <w:abstractNumId w:val="6"/>
+  </w:num>
+  <w:num w:numId="9" w16cid:durableId="1345980779">
+    <w:abstractNumId w:val="5"/>
+  </w:num>
+  <w:num w:numId="10" w16cid:durableId="1312518864">
+    <w:abstractNumId w:val="14"/>
+  </w:num>
+  <w:num w:numId="11" w16cid:durableId="1482884648">
+    <w:abstractNumId w:val="9"/>
+  </w:num>
+  <w:num w:numId="12" w16cid:durableId="440496080">
     <w:abstractNumId w:val="7"/>
   </w:num>
-  <w:num w:numId="2" w16cid:durableId="1816217102">
-    <w:abstractNumId w:val="17"/>
+  <w:num w:numId="13" w16cid:durableId="2029670265">
+    <w:abstractNumId w:val="16"/>
   </w:num>
-  <w:num w:numId="3" w16cid:durableId="1936938849">
-    <w:abstractNumId w:val="19"/>
+  <w:num w:numId="14" w16cid:durableId="1367021860">
+    <w:abstractNumId w:val="4"/>
   </w:num>
-  <w:num w:numId="4" w16cid:durableId="2025206295">
+  <w:num w:numId="15" w16cid:durableId="1386416530">
+    <w:abstractNumId w:val="13"/>
+  </w:num>
+  <w:num w:numId="16" w16cid:durableId="1488933481">
     <w:abstractNumId w:val="11"/>
   </w:num>
-  <w:num w:numId="5" w16cid:durableId="1151948683">
-    <w:abstractNumId w:val="14"/>
-  </w:num>
-  <w:num w:numId="6" w16cid:durableId="716320374">
-    <w:abstractNumId w:val="2"/>
-  </w:num>
-  <w:num w:numId="7" w16cid:durableId="1443114483">
-    <w:abstractNumId w:val="16"/>
-  </w:num>
-  <w:num w:numId="8" w16cid:durableId="2098790857">
-    <w:abstractNumId w:val="5"/>
-  </w:num>
-  <w:num w:numId="9" w16cid:durableId="1345980779">
-    <w:abstractNumId w:val="4"/>
-  </w:num>
-  <w:num w:numId="10" w16cid:durableId="1312518864">
-    <w:abstractNumId w:val="13"/>
-  </w:num>
-  <w:num w:numId="11" w16cid:durableId="1482884648">
-    <w:abstractNumId w:val="8"/>
-  </w:num>
-  <w:num w:numId="12" w16cid:durableId="440496080">
-    <w:abstractNumId w:val="6"/>
-  </w:num>
-  <w:num w:numId="13" w16cid:durableId="2029670265">
-    <w:abstractNumId w:val="15"/>
-  </w:num>
-  <w:num w:numId="14" w16cid:durableId="1367021860">
-    <w:abstractNumId w:val="3"/>
-  </w:num>
-  <w:num w:numId="15" w16cid:durableId="1386416530">
-    <w:abstractNumId w:val="12"/>
-  </w:num>
-  <w:num w:numId="16" w16cid:durableId="1488933481">
+  <w:num w:numId="17" w16cid:durableId="1619145958">
     <w:abstractNumId w:val="10"/>
   </w:num>
-  <w:num w:numId="17" w16cid:durableId="1619145958">
-    <w:abstractNumId w:val="9"/>
-  </w:num>
   <w:num w:numId="18" w16cid:durableId="1152794403">
-    <w:abstractNumId w:val="18"/>
+    <w:abstractNumId w:val="20"/>
   </w:num>
   <w:num w:numId="19" w16cid:durableId="1110391568">
     <w:abstractNumId w:val="1"/>
   </w:num>
   <w:num w:numId="20" w16cid:durableId="1252201917">
     <w:abstractNumId w:val="0"/>
+  </w:num>
+  <w:num w:numId="21" w16cid:durableId="870654099">
+    <w:abstractNumId w:val="2"/>
+  </w:num>
+  <w:num w:numId="22" w16cid:durableId="1976715384">
+    <w:abstractNumId w:val="19"/>
   </w:num>
 </w:numbering>
 </file>
@@ -4475,6 +7949,36 @@
       <w:bCs/>
     </w:rPr>
   </w:style>
+  <w:style w:type="paragraph" w:styleId="HTML">
+    <w:name w:val="HTML Preformatted"/>
+    <w:basedOn w:val="a"/>
+    <w:link w:val="HTML0"/>
+    <w:uiPriority w:val="99"/>
+    <w:semiHidden/>
+    <w:unhideWhenUsed/>
+    <w:rsid w:val="00E11C82"/>
+    <w:pPr>
+      <w:spacing w:after="0" w:line="240" w:lineRule="auto"/>
+    </w:pPr>
+    <w:rPr>
+      <w:rFonts w:ascii="Consolas" w:hAnsi="Consolas"/>
+      <w:sz w:val="20"/>
+      <w:szCs w:val="20"/>
+    </w:rPr>
+  </w:style>
+  <w:style w:type="character" w:customStyle="1" w:styleId="HTML0">
+    <w:name w:val="Стандартный HTML Знак"/>
+    <w:basedOn w:val="a0"/>
+    <w:link w:val="HTML"/>
+    <w:uiPriority w:val="99"/>
+    <w:semiHidden/>
+    <w:rsid w:val="00E11C82"/>
+    <w:rPr>
+      <w:rFonts w:ascii="Consolas" w:hAnsi="Consolas"/>
+      <w:sz w:val="20"/>
+      <w:szCs w:val="20"/>
+    </w:rPr>
+  </w:style>
 </w:styles>
 </file>
 

</xml_diff>